<commit_message>
Render pasted question images
</commit_message>
<xml_diff>
--- a/data/samples/de-mau-azota.docx
+++ b/data/samples/de-mau-azota.docx
@@ -1,6 +1,6 @@
 
 <file path=word/document.xml><?xml version="1.0" encoding="utf-8"?>
-<w:document xmlns:wpc="http://schemas.microsoft.com/office/word/2010/wordprocessingCanvas" xmlns:cx="http://schemas.microsoft.com/office/drawing/2014/chartex" xmlns:cx1="http://schemas.microsoft.com/office/drawing/2015/9/8/chartex" xmlns:cx2="http://schemas.microsoft.com/office/drawing/2015/10/21/chartex" xmlns:cx3="http://schemas.microsoft.com/office/drawing/2016/5/9/chartex" xmlns:cx4="http://schemas.microsoft.com/office/drawing/2016/5/10/chartex" xmlns:cx5="http://schemas.microsoft.com/office/drawing/2016/5/11/chartex" xmlns:cx6="http://schemas.microsoft.com/office/drawing/2016/5/12/chartex" xmlns:cx7="http://schemas.microsoft.com/office/drawing/2016/5/13/chartex" xmlns:cx8="http://schemas.microsoft.com/office/drawing/2016/5/14/chartex" xmlns:mc="http://schemas.openxmlformats.org/markup-compatibility/2006" xmlns:aink="http://schemas.microsoft.com/office/drawing/2016/ink" xmlns:am3d="http://schemas.microsoft.com/office/drawing/2017/model3d" xmlns:o="urn:schemas-microsoft-com:office:office" xmlns:oel="http://schemas.microsoft.com/office/2019/extlst" xmlns:r="http://schemas.openxmlformats.org/officeDocument/2006/relationships" xmlns:m="http://schemas.openxmlformats.org/officeDocument/2006/math" xmlns:v="urn:schemas-microsoft-com:vml" xmlns:wp14="http://schemas.microsoft.com/office/word/2010/wordprocessingDrawing" xmlns:wp="http://schemas.openxmlformats.org/drawingml/2006/wordprocessingDrawing" xmlns:w10="urn:schemas-microsoft-com:office:word" xmlns:w="http://schemas.openxmlformats.org/wordprocessingml/2006/main" xmlns:w14="http://schemas.microsoft.com/office/word/2010/wordml" xmlns:w15="http://schemas.microsoft.com/office/word/2012/wordml" xmlns:w16cex="http://schemas.microsoft.com/office/word/2018/wordml/cex" xmlns:w16cid="http://schemas.microsoft.com/office/word/2016/wordml/cid" xmlns:w16="http://schemas.microsoft.com/office/word/2018/wordml" xmlns:w16du="http://schemas.microsoft.com/office/word/2023/wordml/word16du" xmlns:w16sdtdh="http://schemas.microsoft.com/office/word/2020/wordml/sdtdatahash" xmlns:w16sdtfl="http://schemas.microsoft.com/office/word/2024/wordml/sdtformatlock" xmlns:w16se="http://schemas.microsoft.com/office/word/2015/wordml/symex" xmlns:wpg="http://schemas.microsoft.com/office/word/2010/wordprocessingGroup" xmlns:wpi="http://schemas.microsoft.com/office/word/2010/wordprocessingInk" xmlns:wne="http://schemas.microsoft.com/office/word/2006/wordml" xmlns:wps="http://schemas.microsoft.com/office/word/2010/wordprocessingShape" mc:Ignorable="w14 w15 w16se w16cid w16 w16cex w16sdtdh w16sdtfl w16du wp14">
+<w:document xmlns:wpc="http://schemas.microsoft.com/office/word/2010/wordprocessingCanvas" xmlns:cx="http://schemas.microsoft.com/office/drawing/2014/chartex" xmlns:cx1="http://schemas.microsoft.com/office/drawing/2015/9/8/chartex" xmlns:cx2="http://schemas.microsoft.com/office/drawing/2015/10/21/chartex" xmlns:cx3="http://schemas.microsoft.com/office/drawing/2016/5/9/chartex" xmlns:cx4="http://schemas.microsoft.com/office/drawing/2016/5/10/chartex" xmlns:cx5="http://schemas.microsoft.com/office/drawing/2016/5/11/chartex" xmlns:cx6="http://schemas.microsoft.com/office/drawing/2016/5/12/chartex" xmlns:cx7="http://schemas.microsoft.com/office/drawing/2016/5/13/chartex" xmlns:cx8="http://schemas.microsoft.com/office/drawing/2016/5/14/chartex" xmlns:mc="http://schemas.openxmlformats.org/markup-compatibility/2006" xmlns:aink="http://schemas.microsoft.com/office/drawing/2016/ink" xmlns:am3d="http://schemas.microsoft.com/office/drawing/2017/model3d" xmlns:o="urn:schemas-microsoft-com:office:office" xmlns:oel="http://schemas.microsoft.com/office/2019/extlst" xmlns:r="http://schemas.openxmlformats.org/officeDocument/2006/relationships" xmlns:m="http://schemas.openxmlformats.org/officeDocument/2006/math" xmlns:v="urn:schemas-microsoft-com:vml" xmlns:wp14="http://schemas.microsoft.com/office/word/2010/wordprocessingDrawing" xmlns:wp="http://schemas.openxmlformats.org/drawingml/2006/wordprocessingDrawing" xmlns:w10="urn:schemas-microsoft-com:office:word" xmlns:w="http://schemas.openxmlformats.org/wordprocessingml/2006/main" xmlns:w14="http://schemas.microsoft.com/office/word/2010/wordml" xmlns:w15="http://schemas.microsoft.com/office/word/2012/wordml" xmlns:w16cei="http://schemas.microsoft.com/office/word/2026/wordml/cei" xmlns:w16cex="http://schemas.microsoft.com/office/word/2018/wordml/cex" xmlns:w16cid="http://schemas.microsoft.com/office/word/2016/wordml/cid" xmlns:w16="http://schemas.microsoft.com/office/word/2018/wordml" xmlns:w16du="http://schemas.microsoft.com/office/word/2023/wordml/word16du" xmlns:w16sdtdh="http://schemas.microsoft.com/office/word/2020/wordml/sdtdatahash" xmlns:w16sdtfl="http://schemas.microsoft.com/office/word/2024/wordml/sdtformatlock" xmlns:w16se="http://schemas.microsoft.com/office/word/2015/wordml/symex" xmlns:wpg="http://schemas.microsoft.com/office/word/2010/wordprocessingGroup" xmlns:wpi="http://schemas.microsoft.com/office/word/2010/wordprocessingInk" xmlns:wne="http://schemas.microsoft.com/office/word/2006/wordml" xmlns:wps="http://schemas.microsoft.com/office/word/2010/wordprocessingShape" mc:Ignorable="w14 w15 w16se w16cid w16 w16cex w16sdtdh w16sdtfl w16du wp14">
   <w:body>
     <w:p>
       <w:pPr>
@@ -73,6 +73,7 @@
         <w:rPr>
           <w:rFonts w:cs="Times New Roman"/>
           <w:b/>
+          <w:bCs/>
           <w:szCs w:val="24"/>
         </w:rPr>
       </w:pPr>
@@ -316,6 +317,64 @@
     <w:p>
       <w:pPr>
         <w:tabs>
+          <w:tab w:val="left" w:pos="992"/>
+        </w:tabs>
+        <w:spacing w:before="120" w:after="120" w:line="240" w:lineRule="auto"/>
+        <w:ind w:left="992" w:hanging="992"/>
+        <w:jc w:val="both"/>
+        <w:rPr>
+          <w:rFonts w:cs="Times New Roman"/>
+          <w:b/>
+          <w:szCs w:val="24"/>
+        </w:rPr>
+      </w:pPr>
+      <w:r>
+        <w:rPr>
+          <w:rFonts w:cs="Times New Roman"/>
+          <w:b/>
+          <w:bCs/>
+          <w:szCs w:val="24"/>
+        </w:rPr>
+        <w:drawing>
+          <wp:inline distT="0" distB="0" distL="0" distR="0" wp14:anchorId="3682725A" wp14:editId="4569C5DB">
+            <wp:extent cx="3424237" cy="1401165"/>
+            <wp:effectExtent l="0" t="0" r="5080" b="8890"/>
+            <wp:docPr id="161086043" name="Hình ảnh 1"/>
+            <wp:cNvGraphicFramePr>
+              <a:graphicFrameLocks xmlns:a="http://schemas.openxmlformats.org/drawingml/2006/main" noChangeAspect="1"/>
+            </wp:cNvGraphicFramePr>
+            <a:graphic xmlns:a="http://schemas.openxmlformats.org/drawingml/2006/main">
+              <a:graphicData uri="http://schemas.openxmlformats.org/drawingml/2006/picture">
+                <pic:pic xmlns:pic="http://schemas.openxmlformats.org/drawingml/2006/picture">
+                  <pic:nvPicPr>
+                    <pic:cNvPr id="161086043" name=""/>
+                    <pic:cNvPicPr/>
+                  </pic:nvPicPr>
+                  <pic:blipFill>
+                    <a:blip r:embed="rId7"/>
+                    <a:stretch>
+                      <a:fillRect/>
+                    </a:stretch>
+                  </pic:blipFill>
+                  <pic:spPr>
+                    <a:xfrm>
+                      <a:off x="0" y="0"/>
+                      <a:ext cx="3430050" cy="1403544"/>
+                    </a:xfrm>
+                    <a:prstGeom prst="rect">
+                      <a:avLst/>
+                    </a:prstGeom>
+                  </pic:spPr>
+                </pic:pic>
+              </a:graphicData>
+            </a:graphic>
+          </wp:inline>
+        </w:drawing>
+      </w:r>
+    </w:p>
+    <w:p>
+      <w:pPr>
+        <w:tabs>
           <w:tab w:val="left" w:pos="3402"/>
           <w:tab w:val="left" w:pos="5669"/>
           <w:tab w:val="left" w:pos="7937"/>
@@ -365,7 +424,7 @@
                     </pic:cNvPicPr>
                   </pic:nvPicPr>
                   <pic:blipFill>
-                    <a:blip r:embed="rId7" cstate="print">
+                    <a:blip r:embed="rId8" cstate="print">
                       <a:extLst>
                         <a:ext uri="{28A0092B-C50C-407E-A947-70E740481C1C}">
                           <a14:useLocalDpi xmlns:a14="http://schemas.microsoft.com/office/drawing/2010/main" val="0"/>
@@ -440,7 +499,7 @@
                     </pic:cNvPicPr>
                   </pic:nvPicPr>
                   <pic:blipFill>
-                    <a:blip r:embed="rId8" cstate="print">
+                    <a:blip r:embed="rId9" cstate="print">
                       <a:extLst>
                         <a:ext uri="{28A0092B-C50C-407E-A947-70E740481C1C}">
                           <a14:useLocalDpi xmlns:a14="http://schemas.microsoft.com/office/drawing/2010/main" val="0"/>
@@ -510,81 +569,6 @@
                 <pic:pic xmlns:pic="http://schemas.openxmlformats.org/drawingml/2006/picture">
                   <pic:nvPicPr>
                     <pic:cNvPr id="0" name="Picture 1682"/>
-                    <pic:cNvPicPr>
-                      <a:picLocks noChangeAspect="1" noChangeArrowheads="1"/>
-                    </pic:cNvPicPr>
-                  </pic:nvPicPr>
-                  <pic:blipFill>
-                    <a:blip r:embed="rId9" cstate="print">
-                      <a:extLst>
-                        <a:ext uri="{28A0092B-C50C-407E-A947-70E740481C1C}">
-                          <a14:useLocalDpi xmlns:a14="http://schemas.microsoft.com/office/drawing/2010/main" val="0"/>
-                        </a:ext>
-                      </a:extLst>
-                    </a:blip>
-                    <a:srcRect/>
-                    <a:stretch>
-                      <a:fillRect/>
-                    </a:stretch>
-                  </pic:blipFill>
-                  <pic:spPr bwMode="auto">
-                    <a:xfrm>
-                      <a:off x="0" y="0"/>
-                      <a:ext cx="876300" cy="266700"/>
-                    </a:xfrm>
-                    <a:prstGeom prst="rect">
-                      <a:avLst/>
-                    </a:prstGeom>
-                    <a:noFill/>
-                    <a:ln>
-                      <a:noFill/>
-                    </a:ln>
-                  </pic:spPr>
-                </pic:pic>
-              </a:graphicData>
-            </a:graphic>
-          </wp:inline>
-        </w:drawing>
-      </w:r>
-      <w:r>
-        <w:rPr>
-          <w:rFonts w:cs="Times New Roman"/>
-          <w:szCs w:val="24"/>
-          <w:lang w:val="fr-FR"/>
-        </w:rPr>
-        <w:t>.</w:t>
-      </w:r>
-      <w:r>
-        <w:rPr>
-          <w:rFonts w:cs="Times New Roman"/>
-          <w:b/>
-          <w:bCs/>
-          <w:szCs w:val="24"/>
-        </w:rPr>
-        <w:tab/>
-        <w:t xml:space="preserve">D. </w:t>
-      </w:r>
-      <w:r>
-        <w:rPr>
-          <w:rFonts w:cs="Times New Roman"/>
-          <w:b/>
-          <w:noProof/>
-          <w:position w:val="-14"/>
-          <w:szCs w:val="24"/>
-        </w:rPr>
-        <w:drawing>
-          <wp:inline distT="0" distB="0" distL="0" distR="0" wp14:anchorId="5C9F7459" wp14:editId="6C3F4F39">
-            <wp:extent cx="876300" cy="266700"/>
-            <wp:effectExtent l="0" t="0" r="0" b="0"/>
-            <wp:docPr id="1456983702" name="Picture 1456983702"/>
-            <wp:cNvGraphicFramePr>
-              <a:graphicFrameLocks xmlns:a="http://schemas.openxmlformats.org/drawingml/2006/main" noChangeAspect="1"/>
-            </wp:cNvGraphicFramePr>
-            <a:graphic xmlns:a="http://schemas.openxmlformats.org/drawingml/2006/main">
-              <a:graphicData uri="http://schemas.openxmlformats.org/drawingml/2006/picture">
-                <pic:pic xmlns:pic="http://schemas.openxmlformats.org/drawingml/2006/picture">
-                  <pic:nvPicPr>
-                    <pic:cNvPr id="0" name="Picture 1683"/>
                     <pic:cNvPicPr>
                       <a:picLocks noChangeAspect="1" noChangeArrowheads="1"/>
                     </pic:cNvPicPr>
@@ -629,6 +613,135 @@
         </w:rPr>
         <w:t>.</w:t>
       </w:r>
+      <w:r>
+        <w:rPr>
+          <w:rFonts w:cs="Times New Roman"/>
+          <w:b/>
+          <w:bCs/>
+          <w:szCs w:val="24"/>
+        </w:rPr>
+        <w:tab/>
+        <w:t xml:space="preserve">D. </w:t>
+      </w:r>
+      <w:r>
+        <w:rPr>
+          <w:rFonts w:cs="Times New Roman"/>
+          <w:b/>
+          <w:noProof/>
+          <w:position w:val="-14"/>
+          <w:szCs w:val="24"/>
+        </w:rPr>
+        <w:drawing>
+          <wp:inline distT="0" distB="0" distL="0" distR="0" wp14:anchorId="5C9F7459" wp14:editId="6C3F4F39">
+            <wp:extent cx="876300" cy="266700"/>
+            <wp:effectExtent l="0" t="0" r="0" b="0"/>
+            <wp:docPr id="1456983702" name="Picture 1456983702"/>
+            <wp:cNvGraphicFramePr>
+              <a:graphicFrameLocks xmlns:a="http://schemas.openxmlformats.org/drawingml/2006/main" noChangeAspect="1"/>
+            </wp:cNvGraphicFramePr>
+            <a:graphic xmlns:a="http://schemas.openxmlformats.org/drawingml/2006/main">
+              <a:graphicData uri="http://schemas.openxmlformats.org/drawingml/2006/picture">
+                <pic:pic xmlns:pic="http://schemas.openxmlformats.org/drawingml/2006/picture">
+                  <pic:nvPicPr>
+                    <pic:cNvPr id="0" name="Picture 1683"/>
+                    <pic:cNvPicPr>
+                      <a:picLocks noChangeAspect="1" noChangeArrowheads="1"/>
+                    </pic:cNvPicPr>
+                  </pic:nvPicPr>
+                  <pic:blipFill>
+                    <a:blip r:embed="rId11" cstate="print">
+                      <a:extLst>
+                        <a:ext uri="{28A0092B-C50C-407E-A947-70E740481C1C}">
+                          <a14:useLocalDpi xmlns:a14="http://schemas.microsoft.com/office/drawing/2010/main" val="0"/>
+                        </a:ext>
+                      </a:extLst>
+                    </a:blip>
+                    <a:srcRect/>
+                    <a:stretch>
+                      <a:fillRect/>
+                    </a:stretch>
+                  </pic:blipFill>
+                  <pic:spPr bwMode="auto">
+                    <a:xfrm>
+                      <a:off x="0" y="0"/>
+                      <a:ext cx="876300" cy="266700"/>
+                    </a:xfrm>
+                    <a:prstGeom prst="rect">
+                      <a:avLst/>
+                    </a:prstGeom>
+                    <a:noFill/>
+                    <a:ln>
+                      <a:noFill/>
+                    </a:ln>
+                  </pic:spPr>
+                </pic:pic>
+              </a:graphicData>
+            </a:graphic>
+          </wp:inline>
+        </w:drawing>
+      </w:r>
+      <w:r>
+        <w:rPr>
+          <w:rFonts w:cs="Times New Roman"/>
+          <w:szCs w:val="24"/>
+          <w:lang w:val="fr-FR"/>
+        </w:rPr>
+        <w:t>.</w:t>
+      </w:r>
+    </w:p>
+    <w:p>
+      <w:pPr>
+        <w:tabs>
+          <w:tab w:val="left" w:pos="3402"/>
+          <w:tab w:val="left" w:pos="5669"/>
+          <w:tab w:val="left" w:pos="7937"/>
+        </w:tabs>
+        <w:spacing w:before="120" w:after="120" w:line="240" w:lineRule="auto"/>
+        <w:ind w:left="992"/>
+        <w:contextualSpacing/>
+        <w:jc w:val="both"/>
+        <w:rPr>
+          <w:rFonts w:cs="Times New Roman"/>
+          <w:szCs w:val="24"/>
+          <w:lang w:val="fr-FR"/>
+        </w:rPr>
+      </w:pPr>
+    </w:p>
+    <w:p>
+      <w:pPr>
+        <w:tabs>
+          <w:tab w:val="left" w:pos="3402"/>
+          <w:tab w:val="left" w:pos="5669"/>
+          <w:tab w:val="left" w:pos="7937"/>
+        </w:tabs>
+        <w:spacing w:before="120" w:after="120" w:line="240" w:lineRule="auto"/>
+        <w:ind w:left="992"/>
+        <w:contextualSpacing/>
+        <w:jc w:val="both"/>
+        <w:rPr>
+          <w:rFonts w:cs="Times New Roman"/>
+          <w:szCs w:val="24"/>
+          <w:lang w:val="fr-FR"/>
+        </w:rPr>
+      </w:pPr>
+    </w:p>
+    <w:p>
+      <w:pPr>
+        <w:tabs>
+          <w:tab w:val="left" w:pos="3402"/>
+          <w:tab w:val="left" w:pos="5669"/>
+          <w:tab w:val="left" w:pos="7937"/>
+        </w:tabs>
+        <w:spacing w:before="120" w:after="120" w:line="240" w:lineRule="auto"/>
+        <w:ind w:left="992"/>
+        <w:contextualSpacing/>
+        <w:jc w:val="both"/>
+        <w:rPr>
+          <w:rFonts w:cs="Times New Roman"/>
+          <w:szCs w:val="24"/>
+          <w:lang w:val="fr-FR"/>
+        </w:rPr>
+      </w:pPr>
     </w:p>
     <w:p>
       <w:pPr>
@@ -786,7 +899,7 @@
                     </pic:cNvPicPr>
                   </pic:nvPicPr>
                   <pic:blipFill>
-                    <a:blip r:embed="rId11" cstate="print">
+                    <a:blip r:embed="rId12" cstate="print">
                       <a:extLst>
                         <a:ext uri="{28A0092B-C50C-407E-A947-70E740481C1C}">
                           <a14:useLocalDpi xmlns:a14="http://schemas.microsoft.com/office/drawing/2010/main" val="0"/>
@@ -876,7 +989,7 @@
                     </pic:cNvPicPr>
                   </pic:nvPicPr>
                   <pic:blipFill>
-                    <a:blip r:embed="rId12" cstate="print">
+                    <a:blip r:embed="rId13" cstate="print">
                       <a:extLst>
                         <a:ext uri="{28A0092B-C50C-407E-A947-70E740481C1C}">
                           <a14:useLocalDpi xmlns:a14="http://schemas.microsoft.com/office/drawing/2010/main" val="0"/>
@@ -951,7 +1064,7 @@
                     </pic:cNvPicPr>
                   </pic:nvPicPr>
                   <pic:blipFill>
-                    <a:blip r:embed="rId13" cstate="print">
+                    <a:blip r:embed="rId14" cstate="print">
                       <a:extLst>
                         <a:ext uri="{28A0092B-C50C-407E-A947-70E740481C1C}">
                           <a14:useLocalDpi xmlns:a14="http://schemas.microsoft.com/office/drawing/2010/main" val="0"/>
@@ -1026,7 +1139,7 @@
                     </pic:cNvPicPr>
                   </pic:nvPicPr>
                   <pic:blipFill>
-                    <a:blip r:embed="rId14" cstate="print">
+                    <a:blip r:embed="rId15" cstate="print">
                       <a:extLst>
                         <a:ext uri="{28A0092B-C50C-407E-A947-70E740481C1C}">
                           <a14:useLocalDpi xmlns:a14="http://schemas.microsoft.com/office/drawing/2010/main" val="0"/>
@@ -1101,7 +1214,7 @@
                     </pic:cNvPicPr>
                   </pic:nvPicPr>
                   <pic:blipFill>
-                    <a:blip r:embed="rId15" cstate="print">
+                    <a:blip r:embed="rId16" cstate="print">
                       <a:extLst>
                         <a:ext uri="{28A0092B-C50C-407E-A947-70E740481C1C}">
                           <a14:useLocalDpi xmlns:a14="http://schemas.microsoft.com/office/drawing/2010/main" val="0"/>
@@ -1169,7 +1282,6 @@
         <w:jc w:val="both"/>
         <w:rPr>
           <w:rFonts w:cs="Times New Roman"/>
-          <w:b/>
           <w:szCs w:val="24"/>
           <w:lang w:val="fr-FR"/>
         </w:rPr>
@@ -1235,7 +1347,7 @@
                     </pic:cNvPicPr>
                   </pic:nvPicPr>
                   <pic:blipFill>
-                    <a:blip r:embed="rId16" cstate="print">
+                    <a:blip r:embed="rId17" cstate="print">
                       <a:extLst>
                         <a:ext uri="{28A0092B-C50C-407E-A947-70E740481C1C}">
                           <a14:useLocalDpi xmlns:a14="http://schemas.microsoft.com/office/drawing/2010/main" val="0"/>
@@ -1299,7 +1411,7 @@
                     </pic:cNvPicPr>
                   </pic:nvPicPr>
                   <pic:blipFill>
-                    <a:blip r:embed="rId17" cstate="print">
+                    <a:blip r:embed="rId18" cstate="print">
                       <a:extLst>
                         <a:ext uri="{28A0092B-C50C-407E-A947-70E740481C1C}">
                           <a14:useLocalDpi xmlns:a14="http://schemas.microsoft.com/office/drawing/2010/main" val="0"/>
@@ -1363,7 +1475,7 @@
                     </pic:cNvPicPr>
                   </pic:nvPicPr>
                   <pic:blipFill>
-                    <a:blip r:embed="rId18" cstate="print">
+                    <a:blip r:embed="rId19" cstate="print">
                       <a:extLst>
                         <a:ext uri="{28A0092B-C50C-407E-A947-70E740481C1C}">
                           <a14:useLocalDpi xmlns:a14="http://schemas.microsoft.com/office/drawing/2010/main" val="0"/>
@@ -1427,7 +1539,7 @@
                     </pic:cNvPicPr>
                   </pic:nvPicPr>
                   <pic:blipFill>
-                    <a:blip r:embed="rId19" cstate="print">
+                    <a:blip r:embed="rId20" cstate="print">
                       <a:extLst>
                         <a:ext uri="{28A0092B-C50C-407E-A947-70E740481C1C}">
                           <a14:useLocalDpi xmlns:a14="http://schemas.microsoft.com/office/drawing/2010/main" val="0"/>
@@ -1470,6 +1582,64 @@
     <w:p>
       <w:pPr>
         <w:tabs>
+          <w:tab w:val="left" w:pos="992"/>
+        </w:tabs>
+        <w:spacing w:before="120" w:after="120" w:line="240" w:lineRule="auto"/>
+        <w:ind w:left="992" w:hanging="992"/>
+        <w:jc w:val="both"/>
+        <w:rPr>
+          <w:rFonts w:cs="Times New Roman"/>
+          <w:b/>
+          <w:szCs w:val="24"/>
+          <w:lang w:val="fr-FR"/>
+        </w:rPr>
+      </w:pPr>
+      <w:r>
+        <w:rPr>
+          <w:rFonts w:cs="Times New Roman"/>
+          <w:szCs w:val="24"/>
+          <w:lang w:val="fr-FR"/>
+        </w:rPr>
+        <w:drawing>
+          <wp:inline distT="0" distB="0" distL="0" distR="0" wp14:anchorId="2045D792" wp14:editId="326BCE03">
+            <wp:extent cx="2781688" cy="2029108"/>
+            <wp:effectExtent l="0" t="0" r="0" b="9525"/>
+            <wp:docPr id="403537583" name="Hình ảnh 1"/>
+            <wp:cNvGraphicFramePr>
+              <a:graphicFrameLocks xmlns:a="http://schemas.openxmlformats.org/drawingml/2006/main" noChangeAspect="1"/>
+            </wp:cNvGraphicFramePr>
+            <a:graphic xmlns:a="http://schemas.openxmlformats.org/drawingml/2006/main">
+              <a:graphicData uri="http://schemas.openxmlformats.org/drawingml/2006/picture">
+                <pic:pic xmlns:pic="http://schemas.openxmlformats.org/drawingml/2006/picture">
+                  <pic:nvPicPr>
+                    <pic:cNvPr id="403537583" name=""/>
+                    <pic:cNvPicPr/>
+                  </pic:nvPicPr>
+                  <pic:blipFill>
+                    <a:blip r:embed="rId21"/>
+                    <a:stretch>
+                      <a:fillRect/>
+                    </a:stretch>
+                  </pic:blipFill>
+                  <pic:spPr>
+                    <a:xfrm>
+                      <a:off x="0" y="0"/>
+                      <a:ext cx="2781688" cy="2029108"/>
+                    </a:xfrm>
+                    <a:prstGeom prst="rect">
+                      <a:avLst/>
+                    </a:prstGeom>
+                  </pic:spPr>
+                </pic:pic>
+              </a:graphicData>
+            </a:graphic>
+          </wp:inline>
+        </w:drawing>
+      </w:r>
+    </w:p>
+    <w:p>
+      <w:pPr>
+        <w:tabs>
           <w:tab w:val="left" w:pos="3402"/>
           <w:tab w:val="left" w:pos="5669"/>
           <w:tab w:val="left" w:pos="7937"/>
@@ -1517,7 +1687,7 @@
                     </pic:cNvPicPr>
                   </pic:nvPicPr>
                   <pic:blipFill>
-                    <a:blip r:embed="rId20" cstate="print">
+                    <a:blip r:embed="rId22" cstate="print">
                       <a:extLst>
                         <a:ext uri="{28A0092B-C50C-407E-A947-70E740481C1C}">
                           <a14:useLocalDpi xmlns:a14="http://schemas.microsoft.com/office/drawing/2010/main" val="0"/>
@@ -1591,7 +1761,7 @@
                     </pic:cNvPicPr>
                   </pic:nvPicPr>
                   <pic:blipFill>
-                    <a:blip r:embed="rId21" cstate="print">
+                    <a:blip r:embed="rId23" cstate="print">
                       <a:extLst>
                         <a:ext uri="{28A0092B-C50C-407E-A947-70E740481C1C}">
                           <a14:useLocalDpi xmlns:a14="http://schemas.microsoft.com/office/drawing/2010/main" val="0"/>
@@ -1665,7 +1835,7 @@
                     </pic:cNvPicPr>
                   </pic:nvPicPr>
                   <pic:blipFill>
-                    <a:blip r:embed="rId22" cstate="print">
+                    <a:blip r:embed="rId24" cstate="print">
                       <a:extLst>
                         <a:ext uri="{28A0092B-C50C-407E-A947-70E740481C1C}">
                           <a14:useLocalDpi xmlns:a14="http://schemas.microsoft.com/office/drawing/2010/main" val="0"/>
@@ -1739,7 +1909,7 @@
                     </pic:cNvPicPr>
                   </pic:nvPicPr>
                   <pic:blipFill>
-                    <a:blip r:embed="rId23" cstate="print">
+                    <a:blip r:embed="rId25" cstate="print">
                       <a:extLst>
                         <a:ext uri="{28A0092B-C50C-407E-A947-70E740481C1C}">
                           <a14:useLocalDpi xmlns:a14="http://schemas.microsoft.com/office/drawing/2010/main" val="0"/>
@@ -1799,6 +1969,57 @@
     <w:p>
       <w:pPr>
         <w:tabs>
+          <w:tab w:val="left" w:pos="3402"/>
+          <w:tab w:val="left" w:pos="5669"/>
+          <w:tab w:val="left" w:pos="7937"/>
+        </w:tabs>
+        <w:spacing w:before="120" w:after="120" w:line="240" w:lineRule="auto"/>
+        <w:ind w:left="992"/>
+        <w:jc w:val="both"/>
+        <w:rPr>
+          <w:rFonts w:cs="Times New Roman"/>
+          <w:szCs w:val="24"/>
+          <w:lang w:val="fr-FR"/>
+        </w:rPr>
+      </w:pPr>
+    </w:p>
+    <w:p>
+      <w:pPr>
+        <w:tabs>
+          <w:tab w:val="left" w:pos="3402"/>
+          <w:tab w:val="left" w:pos="5669"/>
+          <w:tab w:val="left" w:pos="7937"/>
+        </w:tabs>
+        <w:spacing w:before="120" w:after="120" w:line="240" w:lineRule="auto"/>
+        <w:ind w:left="992"/>
+        <w:jc w:val="both"/>
+        <w:rPr>
+          <w:rFonts w:cs="Times New Roman"/>
+          <w:szCs w:val="24"/>
+          <w:lang w:val="fr-FR"/>
+        </w:rPr>
+      </w:pPr>
+    </w:p>
+    <w:p>
+      <w:pPr>
+        <w:tabs>
+          <w:tab w:val="left" w:pos="3402"/>
+          <w:tab w:val="left" w:pos="5669"/>
+          <w:tab w:val="left" w:pos="7937"/>
+        </w:tabs>
+        <w:spacing w:before="120" w:after="120" w:line="240" w:lineRule="auto"/>
+        <w:ind w:left="992"/>
+        <w:jc w:val="both"/>
+        <w:rPr>
+          <w:rFonts w:cs="Times New Roman"/>
+          <w:szCs w:val="24"/>
+          <w:lang w:val="fr-FR"/>
+        </w:rPr>
+      </w:pPr>
+    </w:p>
+    <w:p>
+      <w:pPr>
+        <w:tabs>
           <w:tab w:val="left" w:pos="992"/>
         </w:tabs>
         <w:spacing w:before="120" w:after="120" w:line="240" w:lineRule="auto"/>
@@ -1872,7 +2093,7 @@
                     </pic:cNvPicPr>
                   </pic:nvPicPr>
                   <pic:blipFill>
-                    <a:blip r:embed="rId24" cstate="print">
+                    <a:blip r:embed="rId26" cstate="print">
                       <a:extLst>
                         <a:ext uri="{28A0092B-C50C-407E-A947-70E740481C1C}">
                           <a14:useLocalDpi xmlns:a14="http://schemas.microsoft.com/office/drawing/2010/main" val="0"/>
@@ -1936,7 +2157,7 @@
                     </pic:cNvPicPr>
                   </pic:nvPicPr>
                   <pic:blipFill>
-                    <a:blip r:embed="rId25" cstate="print">
+                    <a:blip r:embed="rId27" cstate="print">
                       <a:extLst>
                         <a:ext uri="{28A0092B-C50C-407E-A947-70E740481C1C}">
                           <a14:useLocalDpi xmlns:a14="http://schemas.microsoft.com/office/drawing/2010/main" val="0"/>
@@ -2034,7 +2255,7 @@
                     </pic:cNvPicPr>
                   </pic:nvPicPr>
                   <pic:blipFill>
-                    <a:blip r:embed="rId26" cstate="print">
+                    <a:blip r:embed="rId28" cstate="print">
                       <a:extLst>
                         <a:ext uri="{28A0092B-C50C-407E-A947-70E740481C1C}">
                           <a14:useLocalDpi xmlns:a14="http://schemas.microsoft.com/office/drawing/2010/main" val="0"/>
@@ -2098,6 +2319,7 @@
           <w:szCs w:val="24"/>
           <w:lang w:val="fr-FR"/>
         </w:rPr>
+        <w:lastRenderedPageBreak/>
         <w:t xml:space="preserve">A. </w:t>
       </w:r>
       <w:r>
@@ -2125,7 +2347,7 @@
                     </pic:cNvPicPr>
                   </pic:nvPicPr>
                   <pic:blipFill>
-                    <a:blip r:embed="rId27" cstate="print">
+                    <a:blip r:embed="rId29" cstate="print">
                       <a:extLst>
                         <a:ext uri="{28A0092B-C50C-407E-A947-70E740481C1C}">
                           <a14:useLocalDpi xmlns:a14="http://schemas.microsoft.com/office/drawing/2010/main" val="0"/>
@@ -2199,7 +2421,7 @@
                     </pic:cNvPicPr>
                   </pic:nvPicPr>
                   <pic:blipFill>
-                    <a:blip r:embed="rId28" cstate="print">
+                    <a:blip r:embed="rId30" cstate="print">
                       <a:extLst>
                         <a:ext uri="{28A0092B-C50C-407E-A947-70E740481C1C}">
                           <a14:useLocalDpi xmlns:a14="http://schemas.microsoft.com/office/drawing/2010/main" val="0"/>
@@ -2273,7 +2495,7 @@
                     </pic:cNvPicPr>
                   </pic:nvPicPr>
                   <pic:blipFill>
-                    <a:blip r:embed="rId29" cstate="print">
+                    <a:blip r:embed="rId31" cstate="print">
                       <a:extLst>
                         <a:ext uri="{28A0092B-C50C-407E-A947-70E740481C1C}">
                           <a14:useLocalDpi xmlns:a14="http://schemas.microsoft.com/office/drawing/2010/main" val="0"/>
@@ -2347,7 +2569,7 @@
                     </pic:cNvPicPr>
                   </pic:nvPicPr>
                   <pic:blipFill>
-                    <a:blip r:embed="rId30" cstate="print">
+                    <a:blip r:embed="rId32" cstate="print">
                       <a:extLst>
                         <a:ext uri="{28A0092B-C50C-407E-A947-70E740481C1C}">
                           <a14:useLocalDpi xmlns:a14="http://schemas.microsoft.com/office/drawing/2010/main" val="0"/>
@@ -2481,7 +2703,7 @@
                     </pic:cNvPicPr>
                   </pic:nvPicPr>
                   <pic:blipFill>
-                    <a:blip r:embed="rId31" cstate="print">
+                    <a:blip r:embed="rId33" cstate="print">
                       <a:extLst>
                         <a:ext uri="{28A0092B-C50C-407E-A947-70E740481C1C}">
                           <a14:useLocalDpi xmlns:a14="http://schemas.microsoft.com/office/drawing/2010/main" val="0"/>
@@ -2545,7 +2767,7 @@
                     </pic:cNvPicPr>
                   </pic:nvPicPr>
                   <pic:blipFill>
-                    <a:blip r:embed="rId32" cstate="print">
+                    <a:blip r:embed="rId34" cstate="print">
                       <a:extLst>
                         <a:ext uri="{28A0092B-C50C-407E-A947-70E740481C1C}">
                           <a14:useLocalDpi xmlns:a14="http://schemas.microsoft.com/office/drawing/2010/main" val="0"/>
@@ -2609,7 +2831,7 @@
                     </pic:cNvPicPr>
                   </pic:nvPicPr>
                   <pic:blipFill>
-                    <a:blip r:embed="rId33" cstate="print">
+                    <a:blip r:embed="rId35" cstate="print">
                       <a:extLst>
                         <a:ext uri="{28A0092B-C50C-407E-A947-70E740481C1C}">
                           <a14:useLocalDpi xmlns:a14="http://schemas.microsoft.com/office/drawing/2010/main" val="0"/>
@@ -2673,7 +2895,7 @@
                     </pic:cNvPicPr>
                   </pic:nvPicPr>
                   <pic:blipFill>
-                    <a:blip r:embed="rId34" cstate="print">
+                    <a:blip r:embed="rId36" cstate="print">
                       <a:extLst>
                         <a:ext uri="{28A0092B-C50C-407E-A947-70E740481C1C}">
                           <a14:useLocalDpi xmlns:a14="http://schemas.microsoft.com/office/drawing/2010/main" val="0"/>
@@ -2763,7 +2985,7 @@
                     </pic:cNvPicPr>
                   </pic:nvPicPr>
                   <pic:blipFill>
-                    <a:blip r:embed="rId35" cstate="print">
+                    <a:blip r:embed="rId37" cstate="print">
                       <a:extLst>
                         <a:ext uri="{28A0092B-C50C-407E-A947-70E740481C1C}">
                           <a14:useLocalDpi xmlns:a14="http://schemas.microsoft.com/office/drawing/2010/main" val="0"/>
@@ -2837,7 +3059,7 @@
                     </pic:cNvPicPr>
                   </pic:nvPicPr>
                   <pic:blipFill>
-                    <a:blip r:embed="rId36" cstate="print">
+                    <a:blip r:embed="rId38" cstate="print">
                       <a:extLst>
                         <a:ext uri="{28A0092B-C50C-407E-A947-70E740481C1C}">
                           <a14:useLocalDpi xmlns:a14="http://schemas.microsoft.com/office/drawing/2010/main" val="0"/>
@@ -2911,7 +3133,7 @@
                     </pic:cNvPicPr>
                   </pic:nvPicPr>
                   <pic:blipFill>
-                    <a:blip r:embed="rId37" cstate="print">
+                    <a:blip r:embed="rId39" cstate="print">
                       <a:extLst>
                         <a:ext uri="{28A0092B-C50C-407E-A947-70E740481C1C}">
                           <a14:useLocalDpi xmlns:a14="http://schemas.microsoft.com/office/drawing/2010/main" val="0"/>
@@ -2985,7 +3207,7 @@
                     </pic:cNvPicPr>
                   </pic:nvPicPr>
                   <pic:blipFill>
-                    <a:blip r:embed="rId38" cstate="print">
+                    <a:blip r:embed="rId40" cstate="print">
                       <a:extLst>
                         <a:ext uri="{28A0092B-C50C-407E-A947-70E740481C1C}">
                           <a14:useLocalDpi xmlns:a14="http://schemas.microsoft.com/office/drawing/2010/main" val="0"/>
@@ -3119,7 +3341,7 @@
                     </pic:cNvPicPr>
                   </pic:nvPicPr>
                   <pic:blipFill>
-                    <a:blip r:embed="rId39" cstate="print">
+                    <a:blip r:embed="rId41" cstate="print">
                       <a:extLst>
                         <a:ext uri="{28A0092B-C50C-407E-A947-70E740481C1C}">
                           <a14:useLocalDpi xmlns:a14="http://schemas.microsoft.com/office/drawing/2010/main" val="0"/>
@@ -3192,7 +3414,7 @@
                     </pic:cNvPicPr>
                   </pic:nvPicPr>
                   <pic:blipFill>
-                    <a:blip r:embed="rId40" cstate="print">
+                    <a:blip r:embed="rId42" cstate="print">
                       <a:extLst>
                         <a:ext uri="{28A0092B-C50C-407E-A947-70E740481C1C}">
                           <a14:useLocalDpi xmlns:a14="http://schemas.microsoft.com/office/drawing/2010/main" val="0"/>
@@ -3274,7 +3496,7 @@
                     </pic:cNvPicPr>
                   </pic:nvPicPr>
                   <pic:blipFill>
-                    <a:blip r:embed="rId41" cstate="print">
+                    <a:blip r:embed="rId43" cstate="print">
                       <a:extLst>
                         <a:ext uri="{28A0092B-C50C-407E-A947-70E740481C1C}">
                           <a14:useLocalDpi xmlns:a14="http://schemas.microsoft.com/office/drawing/2010/main" val="0"/>
@@ -3348,7 +3570,7 @@
                     </pic:cNvPicPr>
                   </pic:nvPicPr>
                   <pic:blipFill>
-                    <a:blip r:embed="rId42" cstate="print">
+                    <a:blip r:embed="rId44" cstate="print">
                       <a:extLst>
                         <a:ext uri="{28A0092B-C50C-407E-A947-70E740481C1C}">
                           <a14:useLocalDpi xmlns:a14="http://schemas.microsoft.com/office/drawing/2010/main" val="0"/>
@@ -3422,7 +3644,7 @@
                     </pic:cNvPicPr>
                   </pic:nvPicPr>
                   <pic:blipFill>
-                    <a:blip r:embed="rId43" cstate="print">
+                    <a:blip r:embed="rId45" cstate="print">
                       <a:extLst>
                         <a:ext uri="{28A0092B-C50C-407E-A947-70E740481C1C}">
                           <a14:useLocalDpi xmlns:a14="http://schemas.microsoft.com/office/drawing/2010/main" val="0"/>
@@ -3496,7 +3718,7 @@
                     </pic:cNvPicPr>
                   </pic:nvPicPr>
                   <pic:blipFill>
-                    <a:blip r:embed="rId44" cstate="print">
+                    <a:blip r:embed="rId46" cstate="print">
                       <a:extLst>
                         <a:ext uri="{28A0092B-C50C-407E-A947-70E740481C1C}">
                           <a14:useLocalDpi xmlns:a14="http://schemas.microsoft.com/office/drawing/2010/main" val="0"/>
@@ -3629,7 +3851,7 @@
                     </pic:cNvPicPr>
                   </pic:nvPicPr>
                   <pic:blipFill>
-                    <a:blip r:embed="rId45" cstate="print">
+                    <a:blip r:embed="rId47" cstate="print">
                       <a:extLst>
                         <a:ext uri="{28A0092B-C50C-407E-A947-70E740481C1C}">
                           <a14:useLocalDpi xmlns:a14="http://schemas.microsoft.com/office/drawing/2010/main" val="0"/>
@@ -3693,7 +3915,7 @@
                     </pic:cNvPicPr>
                   </pic:nvPicPr>
                   <pic:blipFill>
-                    <a:blip r:embed="rId46" cstate="print">
+                    <a:blip r:embed="rId48" cstate="print">
                       <a:extLst>
                         <a:ext uri="{28A0092B-C50C-407E-A947-70E740481C1C}">
                           <a14:useLocalDpi xmlns:a14="http://schemas.microsoft.com/office/drawing/2010/main" val="0"/>
@@ -3783,7 +4005,7 @@
                     </pic:cNvPicPr>
                   </pic:nvPicPr>
                   <pic:blipFill>
-                    <a:blip r:embed="rId47" cstate="print">
+                    <a:blip r:embed="rId49" cstate="print">
                       <a:extLst>
                         <a:ext uri="{28A0092B-C50C-407E-A947-70E740481C1C}">
                           <a14:useLocalDpi xmlns:a14="http://schemas.microsoft.com/office/drawing/2010/main" val="0"/>
@@ -3857,7 +4079,7 @@
                     </pic:cNvPicPr>
                   </pic:nvPicPr>
                   <pic:blipFill>
-                    <a:blip r:embed="rId48" cstate="print">
+                    <a:blip r:embed="rId50" cstate="print">
                       <a:extLst>
                         <a:ext uri="{28A0092B-C50C-407E-A947-70E740481C1C}">
                           <a14:useLocalDpi xmlns:a14="http://schemas.microsoft.com/office/drawing/2010/main" val="0"/>
@@ -3931,7 +4153,7 @@
                     </pic:cNvPicPr>
                   </pic:nvPicPr>
                   <pic:blipFill>
-                    <a:blip r:embed="rId49" cstate="print">
+                    <a:blip r:embed="rId51" cstate="print">
                       <a:extLst>
                         <a:ext uri="{28A0092B-C50C-407E-A947-70E740481C1C}">
                           <a14:useLocalDpi xmlns:a14="http://schemas.microsoft.com/office/drawing/2010/main" val="0"/>
@@ -4005,7 +4227,7 @@
                     </pic:cNvPicPr>
                   </pic:nvPicPr>
                   <pic:blipFill>
-                    <a:blip r:embed="rId50" cstate="print">
+                    <a:blip r:embed="rId52" cstate="print">
                       <a:extLst>
                         <a:ext uri="{28A0092B-C50C-407E-A947-70E740481C1C}">
                           <a14:useLocalDpi xmlns:a14="http://schemas.microsoft.com/office/drawing/2010/main" val="0"/>
@@ -4066,7 +4288,6 @@
           <w:szCs w:val="24"/>
           <w:lang w:val="fr-FR"/>
         </w:rPr>
-        <w:lastRenderedPageBreak/>
         <w:t>Câu 8:</w:t>
       </w:r>
       <w:r>
@@ -4121,7 +4342,7 @@
                     </pic:cNvPicPr>
                   </pic:nvPicPr>
                   <pic:blipFill>
-                    <a:blip r:embed="rId51" cstate="print">
+                    <a:blip r:embed="rId53" cstate="print">
                       <a:extLst>
                         <a:ext uri="{28A0092B-C50C-407E-A947-70E740481C1C}">
                           <a14:useLocalDpi xmlns:a14="http://schemas.microsoft.com/office/drawing/2010/main" val="0"/>
@@ -4185,7 +4406,7 @@
                     </pic:cNvPicPr>
                   </pic:nvPicPr>
                   <pic:blipFill>
-                    <a:blip r:embed="rId52" cstate="print">
+                    <a:blip r:embed="rId54" cstate="print">
                       <a:extLst>
                         <a:ext uri="{28A0092B-C50C-407E-A947-70E740481C1C}">
                           <a14:useLocalDpi xmlns:a14="http://schemas.microsoft.com/office/drawing/2010/main" val="0"/>
@@ -4290,7 +4511,7 @@
                     </pic:cNvPicPr>
                   </pic:nvPicPr>
                   <pic:blipFill>
-                    <a:blip r:embed="rId53" cstate="print">
+                    <a:blip r:embed="rId55" cstate="print">
                       <a:extLst>
                         <a:ext uri="{28A0092B-C50C-407E-A947-70E740481C1C}">
                           <a14:useLocalDpi xmlns:a14="http://schemas.microsoft.com/office/drawing/2010/main" val="0"/>
@@ -4365,7 +4586,7 @@
                     </pic:cNvPicPr>
                   </pic:nvPicPr>
                   <pic:blipFill>
-                    <a:blip r:embed="rId54" cstate="print">
+                    <a:blip r:embed="rId56" cstate="print">
                       <a:extLst>
                         <a:ext uri="{28A0092B-C50C-407E-A947-70E740481C1C}">
                           <a14:useLocalDpi xmlns:a14="http://schemas.microsoft.com/office/drawing/2010/main" val="0"/>
@@ -4440,7 +4661,7 @@
                     </pic:cNvPicPr>
                   </pic:nvPicPr>
                   <pic:blipFill>
-                    <a:blip r:embed="rId55" cstate="print">
+                    <a:blip r:embed="rId57" cstate="print">
                       <a:extLst>
                         <a:ext uri="{28A0092B-C50C-407E-A947-70E740481C1C}">
                           <a14:useLocalDpi xmlns:a14="http://schemas.microsoft.com/office/drawing/2010/main" val="0"/>
@@ -4515,7 +4736,7 @@
                     </pic:cNvPicPr>
                   </pic:nvPicPr>
                   <pic:blipFill>
-                    <a:blip r:embed="rId56" cstate="print">
+                    <a:blip r:embed="rId58" cstate="print">
                       <a:extLst>
                         <a:ext uri="{28A0092B-C50C-407E-A947-70E740481C1C}">
                           <a14:useLocalDpi xmlns:a14="http://schemas.microsoft.com/office/drawing/2010/main" val="0"/>
@@ -4648,7 +4869,7 @@
                     </pic:cNvPicPr>
                   </pic:nvPicPr>
                   <pic:blipFill>
-                    <a:blip r:embed="rId57" cstate="print">
+                    <a:blip r:embed="rId59" cstate="print">
                       <a:extLst>
                         <a:ext uri="{28A0092B-C50C-407E-A947-70E740481C1C}">
                           <a14:useLocalDpi xmlns:a14="http://schemas.microsoft.com/office/drawing/2010/main" val="0"/>
@@ -4707,151 +4928,6 @@
                 <pic:pic xmlns:pic="http://schemas.openxmlformats.org/drawingml/2006/picture">
                   <pic:nvPicPr>
                     <pic:cNvPr id="0" name="Picture 1779"/>
-                    <pic:cNvPicPr>
-                      <a:picLocks noChangeAspect="1" noChangeArrowheads="1"/>
-                    </pic:cNvPicPr>
-                  </pic:nvPicPr>
-                  <pic:blipFill>
-                    <a:blip r:embed="rId58" cstate="print">
-                      <a:extLst>
-                        <a:ext uri="{28A0092B-C50C-407E-A947-70E740481C1C}">
-                          <a14:useLocalDpi xmlns:a14="http://schemas.microsoft.com/office/drawing/2010/main" val="0"/>
-                        </a:ext>
-                      </a:extLst>
-                    </a:blip>
-                    <a:srcRect/>
-                    <a:stretch>
-                      <a:fillRect/>
-                    </a:stretch>
-                  </pic:blipFill>
-                  <pic:spPr bwMode="auto">
-                    <a:xfrm>
-                      <a:off x="0" y="0"/>
-                      <a:ext cx="142875" cy="180975"/>
-                    </a:xfrm>
-                    <a:prstGeom prst="rect">
-                      <a:avLst/>
-                    </a:prstGeom>
-                    <a:noFill/>
-                    <a:ln>
-                      <a:noFill/>
-                    </a:ln>
-                  </pic:spPr>
-                </pic:pic>
-              </a:graphicData>
-            </a:graphic>
-          </wp:inline>
-        </w:drawing>
-      </w:r>
-      <w:r>
-        <w:rPr>
-          <w:rFonts w:cs="Times New Roman"/>
-          <w:szCs w:val="24"/>
-          <w:lang w:val="vi-VN"/>
-        </w:rPr>
-        <w:t xml:space="preserve"> có phương trình </w:t>
-      </w:r>
-      <w:r>
-        <w:rPr>
-          <w:rFonts w:cs="Times New Roman"/>
-          <w:noProof/>
-          <w:position w:val="-24"/>
-          <w:szCs w:val="24"/>
-        </w:rPr>
-        <w:drawing>
-          <wp:inline distT="0" distB="0" distL="0" distR="0" wp14:anchorId="2D5B4B4C" wp14:editId="22646B4B">
-            <wp:extent cx="1257300" cy="390525"/>
-            <wp:effectExtent l="0" t="0" r="0" b="9525"/>
-            <wp:docPr id="1456983605" name="Picture 1456983605"/>
-            <wp:cNvGraphicFramePr>
-              <a:graphicFrameLocks xmlns:a="http://schemas.openxmlformats.org/drawingml/2006/main" noChangeAspect="1"/>
-            </wp:cNvGraphicFramePr>
-            <a:graphic xmlns:a="http://schemas.openxmlformats.org/drawingml/2006/main">
-              <a:graphicData uri="http://schemas.openxmlformats.org/drawingml/2006/picture">
-                <pic:pic xmlns:pic="http://schemas.openxmlformats.org/drawingml/2006/picture">
-                  <pic:nvPicPr>
-                    <pic:cNvPr id="0" name="Picture 1780"/>
-                    <pic:cNvPicPr>
-                      <a:picLocks noChangeAspect="1" noChangeArrowheads="1"/>
-                    </pic:cNvPicPr>
-                  </pic:nvPicPr>
-                  <pic:blipFill>
-                    <a:blip r:embed="rId59" cstate="print">
-                      <a:extLst>
-                        <a:ext uri="{28A0092B-C50C-407E-A947-70E740481C1C}">
-                          <a14:useLocalDpi xmlns:a14="http://schemas.microsoft.com/office/drawing/2010/main" val="0"/>
-                        </a:ext>
-                      </a:extLst>
-                    </a:blip>
-                    <a:srcRect/>
-                    <a:stretch>
-                      <a:fillRect/>
-                    </a:stretch>
-                  </pic:blipFill>
-                  <pic:spPr bwMode="auto">
-                    <a:xfrm>
-                      <a:off x="0" y="0"/>
-                      <a:ext cx="1257300" cy="390525"/>
-                    </a:xfrm>
-                    <a:prstGeom prst="rect">
-                      <a:avLst/>
-                    </a:prstGeom>
-                    <a:noFill/>
-                    <a:ln>
-                      <a:noFill/>
-                    </a:ln>
-                  </pic:spPr>
-                </pic:pic>
-              </a:graphicData>
-            </a:graphic>
-          </wp:inline>
-        </w:drawing>
-      </w:r>
-      <w:r>
-        <w:rPr>
-          <w:rFonts w:cs="Times New Roman"/>
-          <w:szCs w:val="24"/>
-          <w:lang w:val="vi-VN"/>
-        </w:rPr>
-        <w:t xml:space="preserve">. Điểm nào sau đây </w:t>
-      </w:r>
-      <w:r>
-        <w:rPr>
-          <w:rFonts w:cs="Times New Roman"/>
-          <w:b/>
-          <w:szCs w:val="24"/>
-          <w:lang w:val="vi-VN"/>
-        </w:rPr>
-        <w:t>không</w:t>
-      </w:r>
-      <w:r>
-        <w:rPr>
-          <w:rFonts w:cs="Times New Roman"/>
-          <w:szCs w:val="24"/>
-          <w:lang w:val="vi-VN"/>
-        </w:rPr>
-        <w:t xml:space="preserve"> thuộc đường thẳng </w:t>
-      </w:r>
-      <w:r>
-        <w:rPr>
-          <w:rFonts w:cs="Times New Roman"/>
-          <w:noProof/>
-          <w:position w:val="-6"/>
-          <w:szCs w:val="24"/>
-        </w:rPr>
-        <w:drawing>
-          <wp:inline distT="0" distB="0" distL="0" distR="0" wp14:anchorId="0174D712" wp14:editId="7A6B7134">
-            <wp:extent cx="142875" cy="180975"/>
-            <wp:effectExtent l="0" t="0" r="9525" b="9525"/>
-            <wp:docPr id="1456983604" name="Picture 1456983604"/>
-            <wp:cNvGraphicFramePr>
-              <a:graphicFrameLocks xmlns:a="http://schemas.openxmlformats.org/drawingml/2006/main" noChangeAspect="1"/>
-            </wp:cNvGraphicFramePr>
-            <a:graphic xmlns:a="http://schemas.openxmlformats.org/drawingml/2006/main">
-              <a:graphicData uri="http://schemas.openxmlformats.org/drawingml/2006/picture">
-                <pic:pic xmlns:pic="http://schemas.openxmlformats.org/drawingml/2006/picture">
-                  <pic:nvPicPr>
-                    <pic:cNvPr id="0" name="Picture 1781"/>
                     <pic:cNvPicPr>
                       <a:picLocks noChangeAspect="1" noChangeArrowheads="1"/>
                     </pic:cNvPicPr>
@@ -4894,6 +4970,151 @@
           <w:szCs w:val="24"/>
           <w:lang w:val="vi-VN"/>
         </w:rPr>
+        <w:t xml:space="preserve"> có phương trình </w:t>
+      </w:r>
+      <w:r>
+        <w:rPr>
+          <w:rFonts w:cs="Times New Roman"/>
+          <w:noProof/>
+          <w:position w:val="-24"/>
+          <w:szCs w:val="24"/>
+        </w:rPr>
+        <w:drawing>
+          <wp:inline distT="0" distB="0" distL="0" distR="0" wp14:anchorId="2D5B4B4C" wp14:editId="22646B4B">
+            <wp:extent cx="1257300" cy="390525"/>
+            <wp:effectExtent l="0" t="0" r="0" b="9525"/>
+            <wp:docPr id="1456983605" name="Picture 1456983605"/>
+            <wp:cNvGraphicFramePr>
+              <a:graphicFrameLocks xmlns:a="http://schemas.openxmlformats.org/drawingml/2006/main" noChangeAspect="1"/>
+            </wp:cNvGraphicFramePr>
+            <a:graphic xmlns:a="http://schemas.openxmlformats.org/drawingml/2006/main">
+              <a:graphicData uri="http://schemas.openxmlformats.org/drawingml/2006/picture">
+                <pic:pic xmlns:pic="http://schemas.openxmlformats.org/drawingml/2006/picture">
+                  <pic:nvPicPr>
+                    <pic:cNvPr id="0" name="Picture 1780"/>
+                    <pic:cNvPicPr>
+                      <a:picLocks noChangeAspect="1" noChangeArrowheads="1"/>
+                    </pic:cNvPicPr>
+                  </pic:nvPicPr>
+                  <pic:blipFill>
+                    <a:blip r:embed="rId61" cstate="print">
+                      <a:extLst>
+                        <a:ext uri="{28A0092B-C50C-407E-A947-70E740481C1C}">
+                          <a14:useLocalDpi xmlns:a14="http://schemas.microsoft.com/office/drawing/2010/main" val="0"/>
+                        </a:ext>
+                      </a:extLst>
+                    </a:blip>
+                    <a:srcRect/>
+                    <a:stretch>
+                      <a:fillRect/>
+                    </a:stretch>
+                  </pic:blipFill>
+                  <pic:spPr bwMode="auto">
+                    <a:xfrm>
+                      <a:off x="0" y="0"/>
+                      <a:ext cx="1257300" cy="390525"/>
+                    </a:xfrm>
+                    <a:prstGeom prst="rect">
+                      <a:avLst/>
+                    </a:prstGeom>
+                    <a:noFill/>
+                    <a:ln>
+                      <a:noFill/>
+                    </a:ln>
+                  </pic:spPr>
+                </pic:pic>
+              </a:graphicData>
+            </a:graphic>
+          </wp:inline>
+        </w:drawing>
+      </w:r>
+      <w:r>
+        <w:rPr>
+          <w:rFonts w:cs="Times New Roman"/>
+          <w:szCs w:val="24"/>
+          <w:lang w:val="vi-VN"/>
+        </w:rPr>
+        <w:t xml:space="preserve">. Điểm nào sau đây </w:t>
+      </w:r>
+      <w:r>
+        <w:rPr>
+          <w:rFonts w:cs="Times New Roman"/>
+          <w:b/>
+          <w:szCs w:val="24"/>
+          <w:lang w:val="vi-VN"/>
+        </w:rPr>
+        <w:t>không</w:t>
+      </w:r>
+      <w:r>
+        <w:rPr>
+          <w:rFonts w:cs="Times New Roman"/>
+          <w:szCs w:val="24"/>
+          <w:lang w:val="vi-VN"/>
+        </w:rPr>
+        <w:t xml:space="preserve"> thuộc đường thẳng </w:t>
+      </w:r>
+      <w:r>
+        <w:rPr>
+          <w:rFonts w:cs="Times New Roman"/>
+          <w:noProof/>
+          <w:position w:val="-6"/>
+          <w:szCs w:val="24"/>
+        </w:rPr>
+        <w:drawing>
+          <wp:inline distT="0" distB="0" distL="0" distR="0" wp14:anchorId="0174D712" wp14:editId="7A6B7134">
+            <wp:extent cx="142875" cy="180975"/>
+            <wp:effectExtent l="0" t="0" r="9525" b="9525"/>
+            <wp:docPr id="1456983604" name="Picture 1456983604"/>
+            <wp:cNvGraphicFramePr>
+              <a:graphicFrameLocks xmlns:a="http://schemas.openxmlformats.org/drawingml/2006/main" noChangeAspect="1"/>
+            </wp:cNvGraphicFramePr>
+            <a:graphic xmlns:a="http://schemas.openxmlformats.org/drawingml/2006/main">
+              <a:graphicData uri="http://schemas.openxmlformats.org/drawingml/2006/picture">
+                <pic:pic xmlns:pic="http://schemas.openxmlformats.org/drawingml/2006/picture">
+                  <pic:nvPicPr>
+                    <pic:cNvPr id="0" name="Picture 1781"/>
+                    <pic:cNvPicPr>
+                      <a:picLocks noChangeAspect="1" noChangeArrowheads="1"/>
+                    </pic:cNvPicPr>
+                  </pic:nvPicPr>
+                  <pic:blipFill>
+                    <a:blip r:embed="rId62" cstate="print">
+                      <a:extLst>
+                        <a:ext uri="{28A0092B-C50C-407E-A947-70E740481C1C}">
+                          <a14:useLocalDpi xmlns:a14="http://schemas.microsoft.com/office/drawing/2010/main" val="0"/>
+                        </a:ext>
+                      </a:extLst>
+                    </a:blip>
+                    <a:srcRect/>
+                    <a:stretch>
+                      <a:fillRect/>
+                    </a:stretch>
+                  </pic:blipFill>
+                  <pic:spPr bwMode="auto">
+                    <a:xfrm>
+                      <a:off x="0" y="0"/>
+                      <a:ext cx="142875" cy="180975"/>
+                    </a:xfrm>
+                    <a:prstGeom prst="rect">
+                      <a:avLst/>
+                    </a:prstGeom>
+                    <a:noFill/>
+                    <a:ln>
+                      <a:noFill/>
+                    </a:ln>
+                  </pic:spPr>
+                </pic:pic>
+              </a:graphicData>
+            </a:graphic>
+          </wp:inline>
+        </w:drawing>
+      </w:r>
+      <w:r>
+        <w:rPr>
+          <w:rFonts w:cs="Times New Roman"/>
+          <w:szCs w:val="24"/>
+          <w:lang w:val="vi-VN"/>
+        </w:rPr>
         <w:t>?</w:t>
       </w:r>
     </w:p>
@@ -4947,7 +5168,7 @@
                     </pic:cNvPicPr>
                   </pic:nvPicPr>
                   <pic:blipFill>
-                    <a:blip r:embed="rId61" cstate="print">
+                    <a:blip r:embed="rId63" cstate="print">
                       <a:extLst>
                         <a:ext uri="{28A0092B-C50C-407E-A947-70E740481C1C}">
                           <a14:useLocalDpi xmlns:a14="http://schemas.microsoft.com/office/drawing/2010/main" val="0"/>
@@ -5022,7 +5243,7 @@
                     </pic:cNvPicPr>
                   </pic:nvPicPr>
                   <pic:blipFill>
-                    <a:blip r:embed="rId62" cstate="print">
+                    <a:blip r:embed="rId64" cstate="print">
                       <a:extLst>
                         <a:ext uri="{28A0092B-C50C-407E-A947-70E740481C1C}">
                           <a14:useLocalDpi xmlns:a14="http://schemas.microsoft.com/office/drawing/2010/main" val="0"/>
@@ -5097,7 +5318,7 @@
                     </pic:cNvPicPr>
                   </pic:nvPicPr>
                   <pic:blipFill>
-                    <a:blip r:embed="rId63" cstate="print">
+                    <a:blip r:embed="rId65" cstate="print">
                       <a:extLst>
                         <a:ext uri="{28A0092B-C50C-407E-A947-70E740481C1C}">
                           <a14:useLocalDpi xmlns:a14="http://schemas.microsoft.com/office/drawing/2010/main" val="0"/>
@@ -5172,7 +5393,7 @@
                     </pic:cNvPicPr>
                   </pic:nvPicPr>
                   <pic:blipFill>
-                    <a:blip r:embed="rId64" cstate="print">
+                    <a:blip r:embed="rId66" cstate="print">
                       <a:extLst>
                         <a:ext uri="{28A0092B-C50C-407E-A947-70E740481C1C}">
                           <a14:useLocalDpi xmlns:a14="http://schemas.microsoft.com/office/drawing/2010/main" val="0"/>
@@ -5308,7 +5529,7 @@
                     </pic:cNvPicPr>
                   </pic:nvPicPr>
                   <pic:blipFill>
-                    <a:blip r:embed="rId65" cstate="print">
+                    <a:blip r:embed="rId67" cstate="print">
                       <a:extLst>
                         <a:ext uri="{28A0092B-C50C-407E-A947-70E740481C1C}">
                           <a14:useLocalDpi xmlns:a14="http://schemas.microsoft.com/office/drawing/2010/main" val="0"/>
@@ -5372,7 +5593,7 @@
                     </pic:cNvPicPr>
                   </pic:nvPicPr>
                   <pic:blipFill>
-                    <a:blip r:embed="rId66" cstate="print">
+                    <a:blip r:embed="rId68" cstate="print">
                       <a:extLst>
                         <a:ext uri="{28A0092B-C50C-407E-A947-70E740481C1C}">
                           <a14:useLocalDpi xmlns:a14="http://schemas.microsoft.com/office/drawing/2010/main" val="0"/>
@@ -5436,7 +5657,7 @@
                     </pic:cNvPicPr>
                   </pic:nvPicPr>
                   <pic:blipFill>
-                    <a:blip r:embed="rId67" cstate="print">
+                    <a:blip r:embed="rId69" cstate="print">
                       <a:extLst>
                         <a:ext uri="{28A0092B-C50C-407E-A947-70E740481C1C}">
                           <a14:useLocalDpi xmlns:a14="http://schemas.microsoft.com/office/drawing/2010/main" val="0"/>
@@ -5500,7 +5721,7 @@
                     </pic:cNvPicPr>
                   </pic:nvPicPr>
                   <pic:blipFill>
-                    <a:blip r:embed="rId68" cstate="print">
+                    <a:blip r:embed="rId70" cstate="print">
                       <a:extLst>
                         <a:ext uri="{28A0092B-C50C-407E-A947-70E740481C1C}">
                           <a14:useLocalDpi xmlns:a14="http://schemas.microsoft.com/office/drawing/2010/main" val="0"/>
@@ -5591,7 +5812,7 @@
                     </pic:cNvPicPr>
                   </pic:nvPicPr>
                   <pic:blipFill>
-                    <a:blip r:embed="rId69" cstate="print">
+                    <a:blip r:embed="rId71" cstate="print">
                       <a:extLst>
                         <a:ext uri="{28A0092B-C50C-407E-A947-70E740481C1C}">
                           <a14:useLocalDpi xmlns:a14="http://schemas.microsoft.com/office/drawing/2010/main" val="0"/>
@@ -5666,7 +5887,7 @@
                     </pic:cNvPicPr>
                   </pic:nvPicPr>
                   <pic:blipFill>
-                    <a:blip r:embed="rId70" cstate="print">
+                    <a:blip r:embed="rId72" cstate="print">
                       <a:extLst>
                         <a:ext uri="{28A0092B-C50C-407E-A947-70E740481C1C}">
                           <a14:useLocalDpi xmlns:a14="http://schemas.microsoft.com/office/drawing/2010/main" val="0"/>
@@ -5741,7 +5962,7 @@
                     </pic:cNvPicPr>
                   </pic:nvPicPr>
                   <pic:blipFill>
-                    <a:blip r:embed="rId71" cstate="print">
+                    <a:blip r:embed="rId73" cstate="print">
                       <a:extLst>
                         <a:ext uri="{28A0092B-C50C-407E-A947-70E740481C1C}">
                           <a14:useLocalDpi xmlns:a14="http://schemas.microsoft.com/office/drawing/2010/main" val="0"/>
@@ -5816,7 +6037,7 @@
                     </pic:cNvPicPr>
                   </pic:nvPicPr>
                   <pic:blipFill>
-                    <a:blip r:embed="rId72" cstate="print">
+                    <a:blip r:embed="rId74" cstate="print">
                       <a:extLst>
                         <a:ext uri="{28A0092B-C50C-407E-A947-70E740481C1C}">
                           <a14:useLocalDpi xmlns:a14="http://schemas.microsoft.com/office/drawing/2010/main" val="0"/>
@@ -5948,7 +6169,7 @@
                     </pic:cNvPicPr>
                   </pic:nvPicPr>
                   <pic:blipFill>
-                    <a:blip r:embed="rId73" cstate="print">
+                    <a:blip r:embed="rId75" cstate="print">
                       <a:extLst>
                         <a:ext uri="{28A0092B-C50C-407E-A947-70E740481C1C}">
                           <a14:useLocalDpi xmlns:a14="http://schemas.microsoft.com/office/drawing/2010/main" val="0"/>
@@ -6012,7 +6233,7 @@
                     </pic:cNvPicPr>
                   </pic:nvPicPr>
                   <pic:blipFill>
-                    <a:blip r:embed="rId74" cstate="print">
+                    <a:blip r:embed="rId76" cstate="print">
                       <a:extLst>
                         <a:ext uri="{28A0092B-C50C-407E-A947-70E740481C1C}">
                           <a14:useLocalDpi xmlns:a14="http://schemas.microsoft.com/office/drawing/2010/main" val="0"/>
@@ -6103,7 +6324,7 @@
                     </pic:cNvPicPr>
                   </pic:nvPicPr>
                   <pic:blipFill>
-                    <a:blip r:embed="rId75" cstate="print">
+                    <a:blip r:embed="rId77" cstate="print">
                       <a:extLst>
                         <a:ext uri="{28A0092B-C50C-407E-A947-70E740481C1C}">
                           <a14:useLocalDpi xmlns:a14="http://schemas.microsoft.com/office/drawing/2010/main" val="0"/>
@@ -6178,7 +6399,7 @@
                     </pic:cNvPicPr>
                   </pic:nvPicPr>
                   <pic:blipFill>
-                    <a:blip r:embed="rId76" cstate="print">
+                    <a:blip r:embed="rId78" cstate="print">
                       <a:extLst>
                         <a:ext uri="{28A0092B-C50C-407E-A947-70E740481C1C}">
                           <a14:useLocalDpi xmlns:a14="http://schemas.microsoft.com/office/drawing/2010/main" val="0"/>
@@ -6252,7 +6473,7 @@
                     </pic:cNvPicPr>
                   </pic:nvPicPr>
                   <pic:blipFill>
-                    <a:blip r:embed="rId77" cstate="print">
+                    <a:blip r:embed="rId79" cstate="print">
                       <a:extLst>
                         <a:ext uri="{28A0092B-C50C-407E-A947-70E740481C1C}">
                           <a14:useLocalDpi xmlns:a14="http://schemas.microsoft.com/office/drawing/2010/main" val="0"/>
@@ -6327,7 +6548,7 @@
                     </pic:cNvPicPr>
                   </pic:nvPicPr>
                   <pic:blipFill>
-                    <a:blip r:embed="rId78" cstate="print">
+                    <a:blip r:embed="rId80" cstate="print">
                       <a:extLst>
                         <a:ext uri="{28A0092B-C50C-407E-A947-70E740481C1C}">
                           <a14:useLocalDpi xmlns:a14="http://schemas.microsoft.com/office/drawing/2010/main" val="0"/>
@@ -6406,6 +6627,7 @@
           <w:szCs w:val="24"/>
           <w:lang w:val="vi-VN"/>
         </w:rPr>
+        <w:lastRenderedPageBreak/>
         <w:t>Câu 12:</w:t>
       </w:r>
       <w:r>
@@ -6459,7 +6681,7 @@
                     </pic:cNvPicPr>
                   </pic:nvPicPr>
                   <pic:blipFill>
-                    <a:blip r:embed="rId79" cstate="print">
+                    <a:blip r:embed="rId81" cstate="print">
                       <a:extLst>
                         <a:ext uri="{28A0092B-C50C-407E-A947-70E740481C1C}">
                           <a14:useLocalDpi xmlns:a14="http://schemas.microsoft.com/office/drawing/2010/main" val="0"/>
@@ -6523,7 +6745,7 @@
                     </pic:cNvPicPr>
                   </pic:nvPicPr>
                   <pic:blipFill>
-                    <a:blip r:embed="rId80" cstate="print">
+                    <a:blip r:embed="rId82" cstate="print">
                       <a:extLst>
                         <a:ext uri="{28A0092B-C50C-407E-A947-70E740481C1C}">
                           <a14:useLocalDpi xmlns:a14="http://schemas.microsoft.com/office/drawing/2010/main" val="0"/>
@@ -6612,7 +6834,7 @@
                     </pic:cNvPicPr>
                   </pic:nvPicPr>
                   <pic:blipFill>
-                    <a:blip r:embed="rId81" cstate="print">
+                    <a:blip r:embed="rId83" cstate="print">
                       <a:extLst>
                         <a:ext uri="{28A0092B-C50C-407E-A947-70E740481C1C}">
                           <a14:useLocalDpi xmlns:a14="http://schemas.microsoft.com/office/drawing/2010/main" val="0"/>
@@ -6681,154 +6903,6 @@
                 <pic:pic xmlns:pic="http://schemas.openxmlformats.org/drawingml/2006/picture">
                   <pic:nvPicPr>
                     <pic:cNvPr id="0" name="Picture 1814"/>
-                    <pic:cNvPicPr>
-                      <a:picLocks noChangeAspect="1" noChangeArrowheads="1"/>
-                    </pic:cNvPicPr>
-                  </pic:nvPicPr>
-                  <pic:blipFill>
-                    <a:blip r:embed="rId82" cstate="print">
-                      <a:extLst>
-                        <a:ext uri="{28A0092B-C50C-407E-A947-70E740481C1C}">
-                          <a14:useLocalDpi xmlns:a14="http://schemas.microsoft.com/office/drawing/2010/main" val="0"/>
-                        </a:ext>
-                      </a:extLst>
-                    </a:blip>
-                    <a:srcRect/>
-                    <a:stretch>
-                      <a:fillRect/>
-                    </a:stretch>
-                  </pic:blipFill>
-                  <pic:spPr bwMode="auto">
-                    <a:xfrm>
-                      <a:off x="0" y="0"/>
-                      <a:ext cx="257175" cy="171450"/>
-                    </a:xfrm>
-                    <a:prstGeom prst="rect">
-                      <a:avLst/>
-                    </a:prstGeom>
-                    <a:noFill/>
-                    <a:ln>
-                      <a:noFill/>
-                    </a:ln>
-                  </pic:spPr>
-                </pic:pic>
-              </a:graphicData>
-            </a:graphic>
-          </wp:inline>
-        </w:drawing>
-      </w:r>
-      <w:r>
-        <w:rPr>
-          <w:rFonts w:cs="Times New Roman"/>
-          <w:szCs w:val="24"/>
-          <w:lang w:val="vi-VN"/>
-        </w:rPr>
-        <w:t>.</w:t>
-      </w:r>
-      <w:r>
-        <w:rPr>
-          <w:rFonts w:cs="Times New Roman"/>
-          <w:b/>
-          <w:szCs w:val="24"/>
-          <w:lang w:val="vi-VN"/>
-        </w:rPr>
-        <w:tab/>
-        <w:t xml:space="preserve">C. </w:t>
-      </w:r>
-      <w:r>
-        <w:rPr>
-          <w:rFonts w:cs="Times New Roman"/>
-          <w:noProof/>
-          <w:position w:val="-6"/>
-          <w:szCs w:val="24"/>
-        </w:rPr>
-        <w:drawing>
-          <wp:inline distT="0" distB="0" distL="0" distR="0" wp14:anchorId="07CC81A5" wp14:editId="4B963B95">
-            <wp:extent cx="257175" cy="171450"/>
-            <wp:effectExtent l="0" t="0" r="9525" b="0"/>
-            <wp:docPr id="1456983570" name="Picture 1456983570"/>
-            <wp:cNvGraphicFramePr>
-              <a:graphicFrameLocks xmlns:a="http://schemas.openxmlformats.org/drawingml/2006/main" noChangeAspect="1"/>
-            </wp:cNvGraphicFramePr>
-            <a:graphic xmlns:a="http://schemas.openxmlformats.org/drawingml/2006/main">
-              <a:graphicData uri="http://schemas.openxmlformats.org/drawingml/2006/picture">
-                <pic:pic xmlns:pic="http://schemas.openxmlformats.org/drawingml/2006/picture">
-                  <pic:nvPicPr>
-                    <pic:cNvPr id="0" name="Picture 1815"/>
-                    <pic:cNvPicPr>
-                      <a:picLocks noChangeAspect="1" noChangeArrowheads="1"/>
-                    </pic:cNvPicPr>
-                  </pic:nvPicPr>
-                  <pic:blipFill>
-                    <a:blip r:embed="rId83" cstate="print">
-                      <a:extLst>
-                        <a:ext uri="{28A0092B-C50C-407E-A947-70E740481C1C}">
-                          <a14:useLocalDpi xmlns:a14="http://schemas.microsoft.com/office/drawing/2010/main" val="0"/>
-                        </a:ext>
-                      </a:extLst>
-                    </a:blip>
-                    <a:srcRect/>
-                    <a:stretch>
-                      <a:fillRect/>
-                    </a:stretch>
-                  </pic:blipFill>
-                  <pic:spPr bwMode="auto">
-                    <a:xfrm>
-                      <a:off x="0" y="0"/>
-                      <a:ext cx="257175" cy="171450"/>
-                    </a:xfrm>
-                    <a:prstGeom prst="rect">
-                      <a:avLst/>
-                    </a:prstGeom>
-                    <a:noFill/>
-                    <a:ln>
-                      <a:noFill/>
-                    </a:ln>
-                  </pic:spPr>
-                </pic:pic>
-              </a:graphicData>
-            </a:graphic>
-          </wp:inline>
-        </w:drawing>
-      </w:r>
-      <w:r>
-        <w:rPr>
-          <w:rFonts w:cs="Times New Roman"/>
-          <w:szCs w:val="24"/>
-          <w:lang w:val="vi-VN"/>
-        </w:rPr>
-        <w:t>.</w:t>
-      </w:r>
-      <w:r>
-        <w:rPr>
-          <w:rFonts w:cs="Times New Roman"/>
-          <w:b/>
-          <w:szCs w:val="24"/>
-          <w:lang w:val="vi-VN"/>
-        </w:rPr>
-        <w:tab/>
-        <w:t xml:space="preserve">D. </w:t>
-      </w:r>
-      <w:r>
-        <w:rPr>
-          <w:rFonts w:cs="Times New Roman"/>
-          <w:noProof/>
-          <w:position w:val="-6"/>
-          <w:szCs w:val="24"/>
-        </w:rPr>
-        <w:drawing>
-          <wp:inline distT="0" distB="0" distL="0" distR="0" wp14:anchorId="5D789626" wp14:editId="76251388">
-            <wp:extent cx="257175" cy="171450"/>
-            <wp:effectExtent l="0" t="0" r="9525" b="0"/>
-            <wp:docPr id="1456983569" name="Picture 1456983569"/>
-            <wp:cNvGraphicFramePr>
-              <a:graphicFrameLocks xmlns:a="http://schemas.openxmlformats.org/drawingml/2006/main" noChangeAspect="1"/>
-            </wp:cNvGraphicFramePr>
-            <a:graphic xmlns:a="http://schemas.openxmlformats.org/drawingml/2006/main">
-              <a:graphicData uri="http://schemas.openxmlformats.org/drawingml/2006/picture">
-                <pic:pic xmlns:pic="http://schemas.openxmlformats.org/drawingml/2006/picture">
-                  <pic:nvPicPr>
-                    <pic:cNvPr id="0" name="Picture 1816"/>
                     <pic:cNvPicPr>
                       <a:picLocks noChangeAspect="1" noChangeArrowheads="1"/>
                     </pic:cNvPicPr>
@@ -6873,6 +6947,154 @@
         </w:rPr>
         <w:t>.</w:t>
       </w:r>
+      <w:r>
+        <w:rPr>
+          <w:rFonts w:cs="Times New Roman"/>
+          <w:b/>
+          <w:szCs w:val="24"/>
+          <w:lang w:val="vi-VN"/>
+        </w:rPr>
+        <w:tab/>
+        <w:t xml:space="preserve">C. </w:t>
+      </w:r>
+      <w:r>
+        <w:rPr>
+          <w:rFonts w:cs="Times New Roman"/>
+          <w:noProof/>
+          <w:position w:val="-6"/>
+          <w:szCs w:val="24"/>
+        </w:rPr>
+        <w:drawing>
+          <wp:inline distT="0" distB="0" distL="0" distR="0" wp14:anchorId="07CC81A5" wp14:editId="4B963B95">
+            <wp:extent cx="257175" cy="171450"/>
+            <wp:effectExtent l="0" t="0" r="9525" b="0"/>
+            <wp:docPr id="1456983570" name="Picture 1456983570"/>
+            <wp:cNvGraphicFramePr>
+              <a:graphicFrameLocks xmlns:a="http://schemas.openxmlformats.org/drawingml/2006/main" noChangeAspect="1"/>
+            </wp:cNvGraphicFramePr>
+            <a:graphic xmlns:a="http://schemas.openxmlformats.org/drawingml/2006/main">
+              <a:graphicData uri="http://schemas.openxmlformats.org/drawingml/2006/picture">
+                <pic:pic xmlns:pic="http://schemas.openxmlformats.org/drawingml/2006/picture">
+                  <pic:nvPicPr>
+                    <pic:cNvPr id="0" name="Picture 1815"/>
+                    <pic:cNvPicPr>
+                      <a:picLocks noChangeAspect="1" noChangeArrowheads="1"/>
+                    </pic:cNvPicPr>
+                  </pic:nvPicPr>
+                  <pic:blipFill>
+                    <a:blip r:embed="rId85" cstate="print">
+                      <a:extLst>
+                        <a:ext uri="{28A0092B-C50C-407E-A947-70E740481C1C}">
+                          <a14:useLocalDpi xmlns:a14="http://schemas.microsoft.com/office/drawing/2010/main" val="0"/>
+                        </a:ext>
+                      </a:extLst>
+                    </a:blip>
+                    <a:srcRect/>
+                    <a:stretch>
+                      <a:fillRect/>
+                    </a:stretch>
+                  </pic:blipFill>
+                  <pic:spPr bwMode="auto">
+                    <a:xfrm>
+                      <a:off x="0" y="0"/>
+                      <a:ext cx="257175" cy="171450"/>
+                    </a:xfrm>
+                    <a:prstGeom prst="rect">
+                      <a:avLst/>
+                    </a:prstGeom>
+                    <a:noFill/>
+                    <a:ln>
+                      <a:noFill/>
+                    </a:ln>
+                  </pic:spPr>
+                </pic:pic>
+              </a:graphicData>
+            </a:graphic>
+          </wp:inline>
+        </w:drawing>
+      </w:r>
+      <w:r>
+        <w:rPr>
+          <w:rFonts w:cs="Times New Roman"/>
+          <w:szCs w:val="24"/>
+          <w:lang w:val="vi-VN"/>
+        </w:rPr>
+        <w:t>.</w:t>
+      </w:r>
+      <w:r>
+        <w:rPr>
+          <w:rFonts w:cs="Times New Roman"/>
+          <w:b/>
+          <w:szCs w:val="24"/>
+          <w:lang w:val="vi-VN"/>
+        </w:rPr>
+        <w:tab/>
+        <w:t xml:space="preserve">D. </w:t>
+      </w:r>
+      <w:r>
+        <w:rPr>
+          <w:rFonts w:cs="Times New Roman"/>
+          <w:noProof/>
+          <w:position w:val="-6"/>
+          <w:szCs w:val="24"/>
+        </w:rPr>
+        <w:drawing>
+          <wp:inline distT="0" distB="0" distL="0" distR="0" wp14:anchorId="5D789626" wp14:editId="76251388">
+            <wp:extent cx="257175" cy="171450"/>
+            <wp:effectExtent l="0" t="0" r="9525" b="0"/>
+            <wp:docPr id="1456983569" name="Picture 1456983569"/>
+            <wp:cNvGraphicFramePr>
+              <a:graphicFrameLocks xmlns:a="http://schemas.openxmlformats.org/drawingml/2006/main" noChangeAspect="1"/>
+            </wp:cNvGraphicFramePr>
+            <a:graphic xmlns:a="http://schemas.openxmlformats.org/drawingml/2006/main">
+              <a:graphicData uri="http://schemas.openxmlformats.org/drawingml/2006/picture">
+                <pic:pic xmlns:pic="http://schemas.openxmlformats.org/drawingml/2006/picture">
+                  <pic:nvPicPr>
+                    <pic:cNvPr id="0" name="Picture 1816"/>
+                    <pic:cNvPicPr>
+                      <a:picLocks noChangeAspect="1" noChangeArrowheads="1"/>
+                    </pic:cNvPicPr>
+                  </pic:nvPicPr>
+                  <pic:blipFill>
+                    <a:blip r:embed="rId86" cstate="print">
+                      <a:extLst>
+                        <a:ext uri="{28A0092B-C50C-407E-A947-70E740481C1C}">
+                          <a14:useLocalDpi xmlns:a14="http://schemas.microsoft.com/office/drawing/2010/main" val="0"/>
+                        </a:ext>
+                      </a:extLst>
+                    </a:blip>
+                    <a:srcRect/>
+                    <a:stretch>
+                      <a:fillRect/>
+                    </a:stretch>
+                  </pic:blipFill>
+                  <pic:spPr bwMode="auto">
+                    <a:xfrm>
+                      <a:off x="0" y="0"/>
+                      <a:ext cx="257175" cy="171450"/>
+                    </a:xfrm>
+                    <a:prstGeom prst="rect">
+                      <a:avLst/>
+                    </a:prstGeom>
+                    <a:noFill/>
+                    <a:ln>
+                      <a:noFill/>
+                    </a:ln>
+                  </pic:spPr>
+                </pic:pic>
+              </a:graphicData>
+            </a:graphic>
+          </wp:inline>
+        </w:drawing>
+      </w:r>
+      <w:r>
+        <w:rPr>
+          <w:rFonts w:cs="Times New Roman"/>
+          <w:szCs w:val="24"/>
+          <w:lang w:val="vi-VN"/>
+        </w:rPr>
+        <w:t>.</w:t>
+      </w:r>
     </w:p>
     <w:p>
       <w:pPr>
@@ -7246,7 +7468,6 @@
           <w:lang w:val="vi-VN"/>
           <w14:ligatures w14:val="none"/>
         </w:rPr>
-        <w:lastRenderedPageBreak/>
         <w:t xml:space="preserve">PHẦN II. Câu trắc nghiệm đúng sai. </w:t>
       </w:r>
       <w:r>
@@ -7325,7 +7546,7 @@
                     </pic:cNvPicPr>
                   </pic:nvPicPr>
                   <pic:blipFill>
-                    <a:blip r:embed="rId85" cstate="print">
+                    <a:blip r:embed="rId87" cstate="print">
                       <a:extLst>
                         <a:ext uri="{28A0092B-C50C-407E-A947-70E740481C1C}">
                           <a14:useLocalDpi xmlns:a14="http://schemas.microsoft.com/office/drawing/2010/main" val="0"/>
@@ -7394,7 +7615,7 @@
                     </pic:cNvPicPr>
                   </pic:nvPicPr>
                   <pic:blipFill>
-                    <a:blip r:embed="rId86" cstate="print">
+                    <a:blip r:embed="rId88" cstate="print">
                       <a:extLst>
                         <a:ext uri="{28A0092B-C50C-407E-A947-70E740481C1C}">
                           <a14:useLocalDpi xmlns:a14="http://schemas.microsoft.com/office/drawing/2010/main" val="0"/>
@@ -7501,7 +7722,7 @@
                     </pic:cNvPicPr>
                   </pic:nvPicPr>
                   <pic:blipFill>
-                    <a:blip r:embed="rId87" cstate="print">
+                    <a:blip r:embed="rId89" cstate="print">
                       <a:extLst>
                         <a:ext uri="{28A0092B-C50C-407E-A947-70E740481C1C}">
                           <a14:useLocalDpi xmlns:a14="http://schemas.microsoft.com/office/drawing/2010/main" val="0"/>
@@ -7565,7 +7786,7 @@
                     </pic:cNvPicPr>
                   </pic:nvPicPr>
                   <pic:blipFill>
-                    <a:blip r:embed="rId88" cstate="print">
+                    <a:blip r:embed="rId90" cstate="print">
                       <a:extLst>
                         <a:ext uri="{28A0092B-C50C-407E-A947-70E740481C1C}">
                           <a14:useLocalDpi xmlns:a14="http://schemas.microsoft.com/office/drawing/2010/main" val="0"/>
@@ -7660,7 +7881,7 @@
                     </pic:cNvPicPr>
                   </pic:nvPicPr>
                   <pic:blipFill>
-                    <a:blip r:embed="rId89" cstate="print">
+                    <a:blip r:embed="rId91" cstate="print">
                       <a:extLst>
                         <a:ext uri="{28A0092B-C50C-407E-A947-70E740481C1C}">
                           <a14:useLocalDpi xmlns:a14="http://schemas.microsoft.com/office/drawing/2010/main" val="0"/>
@@ -7719,260 +7940,6 @@
                 <pic:pic xmlns:pic="http://schemas.openxmlformats.org/drawingml/2006/picture">
                   <pic:nvPicPr>
                     <pic:cNvPr id="0" name="Picture 1833"/>
-                    <pic:cNvPicPr>
-                      <a:picLocks noChangeAspect="1" noChangeArrowheads="1"/>
-                    </pic:cNvPicPr>
-                  </pic:nvPicPr>
-                  <pic:blipFill>
-                    <a:blip r:embed="rId90" cstate="print">
-                      <a:extLst>
-                        <a:ext uri="{28A0092B-C50C-407E-A947-70E740481C1C}">
-                          <a14:useLocalDpi xmlns:a14="http://schemas.microsoft.com/office/drawing/2010/main" val="0"/>
-                        </a:ext>
-                      </a:extLst>
-                    </a:blip>
-                    <a:srcRect/>
-                    <a:stretch>
-                      <a:fillRect/>
-                    </a:stretch>
-                  </pic:blipFill>
-                  <pic:spPr bwMode="auto">
-                    <a:xfrm>
-                      <a:off x="0" y="0"/>
-                      <a:ext cx="142875" cy="180975"/>
-                    </a:xfrm>
-                    <a:prstGeom prst="rect">
-                      <a:avLst/>
-                    </a:prstGeom>
-                    <a:noFill/>
-                    <a:ln>
-                      <a:noFill/>
-                    </a:ln>
-                  </pic:spPr>
-                </pic:pic>
-              </a:graphicData>
-            </a:graphic>
-          </wp:inline>
-        </w:drawing>
-      </w:r>
-      <w:r>
-        <w:rPr>
-          <w:rFonts w:cs="Times New Roman"/>
-          <w:szCs w:val="24"/>
-          <w:lang w:val="vi-VN" w:eastAsia="en-GB"/>
-        </w:rPr>
-        <w:t>.</w:t>
-      </w:r>
-    </w:p>
-    <w:p>
-      <w:pPr>
-        <w:widowControl w:val="0"/>
-        <w:spacing w:before="120" w:after="120" w:line="240" w:lineRule="auto"/>
-        <w:ind w:left="992" w:firstLine="1"/>
-        <w:jc w:val="both"/>
-        <w:rPr>
-          <w:rFonts w:cs="Times New Roman"/>
-          <w:szCs w:val="24"/>
-          <w:lang w:val="vi-VN" w:eastAsia="en-GB"/>
-        </w:rPr>
-      </w:pPr>
-      <w:r>
-        <w:rPr>
-          <w:rFonts w:cs="Times New Roman"/>
-          <w:b/>
-          <w:bCs/>
-          <w:szCs w:val="24"/>
-          <w:lang w:val="vi-VN" w:eastAsia="en-GB"/>
-        </w:rPr>
-        <w:t>c)</w:t>
-      </w:r>
-      <w:r>
-        <w:rPr>
-          <w:rFonts w:cs="Times New Roman"/>
-          <w:szCs w:val="24"/>
-          <w:lang w:val="vi-VN" w:eastAsia="en-GB"/>
-        </w:rPr>
-        <w:t xml:space="preserve"> Điểm </w:t>
-      </w:r>
-      <w:r>
-        <w:rPr>
-          <w:rFonts w:cs="Times New Roman"/>
-          <w:noProof/>
-          <w:position w:val="-14"/>
-          <w:szCs w:val="24"/>
-        </w:rPr>
-        <w:drawing>
-          <wp:inline distT="0" distB="0" distL="0" distR="0" wp14:anchorId="03A15BDB" wp14:editId="604D9C46">
-            <wp:extent cx="762000" cy="257175"/>
-            <wp:effectExtent l="0" t="0" r="0" b="9525"/>
-            <wp:docPr id="1456983551" name="Picture 1456983551"/>
-            <wp:cNvGraphicFramePr>
-              <a:graphicFrameLocks xmlns:a="http://schemas.openxmlformats.org/drawingml/2006/main" noChangeAspect="1"/>
-            </wp:cNvGraphicFramePr>
-            <a:graphic xmlns:a="http://schemas.openxmlformats.org/drawingml/2006/main">
-              <a:graphicData uri="http://schemas.openxmlformats.org/drawingml/2006/picture">
-                <pic:pic xmlns:pic="http://schemas.openxmlformats.org/drawingml/2006/picture">
-                  <pic:nvPicPr>
-                    <pic:cNvPr id="0" name="Picture 1834"/>
-                    <pic:cNvPicPr>
-                      <a:picLocks noChangeAspect="1" noChangeArrowheads="1"/>
-                    </pic:cNvPicPr>
-                  </pic:nvPicPr>
-                  <pic:blipFill>
-                    <a:blip r:embed="rId91" cstate="print">
-                      <a:extLst>
-                        <a:ext uri="{28A0092B-C50C-407E-A947-70E740481C1C}">
-                          <a14:useLocalDpi xmlns:a14="http://schemas.microsoft.com/office/drawing/2010/main" val="0"/>
-                        </a:ext>
-                      </a:extLst>
-                    </a:blip>
-                    <a:srcRect/>
-                    <a:stretch>
-                      <a:fillRect/>
-                    </a:stretch>
-                  </pic:blipFill>
-                  <pic:spPr bwMode="auto">
-                    <a:xfrm>
-                      <a:off x="0" y="0"/>
-                      <a:ext cx="762000" cy="257175"/>
-                    </a:xfrm>
-                    <a:prstGeom prst="rect">
-                      <a:avLst/>
-                    </a:prstGeom>
-                    <a:noFill/>
-                    <a:ln>
-                      <a:noFill/>
-                    </a:ln>
-                  </pic:spPr>
-                </pic:pic>
-              </a:graphicData>
-            </a:graphic>
-          </wp:inline>
-        </w:drawing>
-      </w:r>
-      <w:r>
-        <w:rPr>
-          <w:rFonts w:cs="Times New Roman"/>
-          <w:szCs w:val="24"/>
-          <w:lang w:val="vi-VN" w:eastAsia="en-GB"/>
-        </w:rPr>
-        <w:t xml:space="preserve"> không thuộc đường thẳng </w:t>
-      </w:r>
-      <w:r>
-        <w:rPr>
-          <w:rFonts w:cs="Times New Roman"/>
-          <w:noProof/>
-          <w:position w:val="-6"/>
-          <w:szCs w:val="24"/>
-        </w:rPr>
-        <w:drawing>
-          <wp:inline distT="0" distB="0" distL="0" distR="0" wp14:anchorId="1C7120B8" wp14:editId="3B00ECEA">
-            <wp:extent cx="142875" cy="180975"/>
-            <wp:effectExtent l="0" t="0" r="9525" b="9525"/>
-            <wp:docPr id="1456983550" name="Picture 1456983550"/>
-            <wp:cNvGraphicFramePr>
-              <a:graphicFrameLocks xmlns:a="http://schemas.openxmlformats.org/drawingml/2006/main" noChangeAspect="1"/>
-            </wp:cNvGraphicFramePr>
-            <a:graphic xmlns:a="http://schemas.openxmlformats.org/drawingml/2006/main">
-              <a:graphicData uri="http://schemas.openxmlformats.org/drawingml/2006/picture">
-                <pic:pic xmlns:pic="http://schemas.openxmlformats.org/drawingml/2006/picture">
-                  <pic:nvPicPr>
-                    <pic:cNvPr id="0" name="Picture 1835"/>
-                    <pic:cNvPicPr>
-                      <a:picLocks noChangeAspect="1" noChangeArrowheads="1"/>
-                    </pic:cNvPicPr>
-                  </pic:nvPicPr>
-                  <pic:blipFill>
-                    <a:blip r:embed="rId90" cstate="print">
-                      <a:extLst>
-                        <a:ext uri="{28A0092B-C50C-407E-A947-70E740481C1C}">
-                          <a14:useLocalDpi xmlns:a14="http://schemas.microsoft.com/office/drawing/2010/main" val="0"/>
-                        </a:ext>
-                      </a:extLst>
-                    </a:blip>
-                    <a:srcRect/>
-                    <a:stretch>
-                      <a:fillRect/>
-                    </a:stretch>
-                  </pic:blipFill>
-                  <pic:spPr bwMode="auto">
-                    <a:xfrm>
-                      <a:off x="0" y="0"/>
-                      <a:ext cx="142875" cy="180975"/>
-                    </a:xfrm>
-                    <a:prstGeom prst="rect">
-                      <a:avLst/>
-                    </a:prstGeom>
-                    <a:noFill/>
-                    <a:ln>
-                      <a:noFill/>
-                    </a:ln>
-                  </pic:spPr>
-                </pic:pic>
-              </a:graphicData>
-            </a:graphic>
-          </wp:inline>
-        </w:drawing>
-      </w:r>
-      <w:r>
-        <w:rPr>
-          <w:rFonts w:cs="Times New Roman"/>
-          <w:szCs w:val="24"/>
-          <w:lang w:val="vi-VN"/>
-        </w:rPr>
-        <w:t>.</w:t>
-      </w:r>
-    </w:p>
-    <w:p>
-      <w:pPr>
-        <w:widowControl w:val="0"/>
-        <w:spacing w:before="120" w:after="120" w:line="240" w:lineRule="auto"/>
-        <w:ind w:left="992" w:firstLine="1"/>
-        <w:jc w:val="both"/>
-        <w:rPr>
-          <w:rFonts w:cs="Times New Roman"/>
-          <w:szCs w:val="24"/>
-          <w:lang w:val="vi-VN" w:eastAsia="en-GB"/>
-        </w:rPr>
-      </w:pPr>
-      <w:r>
-        <w:rPr>
-          <w:rFonts w:cs="Times New Roman"/>
-          <w:b/>
-          <w:bCs/>
-          <w:szCs w:val="24"/>
-          <w:lang w:val="vi-VN" w:eastAsia="en-GB"/>
-        </w:rPr>
-        <w:t>d)</w:t>
-      </w:r>
-      <w:r>
-        <w:rPr>
-          <w:rFonts w:cs="Times New Roman"/>
-          <w:szCs w:val="24"/>
-          <w:lang w:val="vi-VN" w:eastAsia="en-GB"/>
-        </w:rPr>
-        <w:t xml:space="preserve"> Phương trình chính tắc của đường thẳng </w:t>
-      </w:r>
-      <w:r>
-        <w:rPr>
-          <w:rFonts w:cs="Times New Roman"/>
-          <w:noProof/>
-          <w:position w:val="-6"/>
-          <w:szCs w:val="24"/>
-        </w:rPr>
-        <w:drawing>
-          <wp:inline distT="0" distB="0" distL="0" distR="0" wp14:anchorId="2D8D9E15" wp14:editId="2CF653A3">
-            <wp:extent cx="142875" cy="180975"/>
-            <wp:effectExtent l="0" t="0" r="9525" b="9525"/>
-            <wp:docPr id="1456983549" name="Picture 1456983549"/>
-            <wp:cNvGraphicFramePr>
-              <a:graphicFrameLocks xmlns:a="http://schemas.openxmlformats.org/drawingml/2006/main" noChangeAspect="1"/>
-            </wp:cNvGraphicFramePr>
-            <a:graphic xmlns:a="http://schemas.openxmlformats.org/drawingml/2006/main">
-              <a:graphicData uri="http://schemas.openxmlformats.org/drawingml/2006/picture">
-                <pic:pic xmlns:pic="http://schemas.openxmlformats.org/drawingml/2006/picture">
-                  <pic:nvPicPr>
-                    <pic:cNvPr id="0" name="Picture 1836"/>
                     <pic:cNvPicPr>
                       <a:picLocks noChangeAspect="1" noChangeArrowheads="1"/>
                     </pic:cNvPicPr>
@@ -8015,6 +7982,260 @@
           <w:szCs w:val="24"/>
           <w:lang w:val="vi-VN" w:eastAsia="en-GB"/>
         </w:rPr>
+        <w:t>.</w:t>
+      </w:r>
+    </w:p>
+    <w:p>
+      <w:pPr>
+        <w:widowControl w:val="0"/>
+        <w:spacing w:before="120" w:after="120" w:line="240" w:lineRule="auto"/>
+        <w:ind w:left="992" w:firstLine="1"/>
+        <w:jc w:val="both"/>
+        <w:rPr>
+          <w:rFonts w:cs="Times New Roman"/>
+          <w:szCs w:val="24"/>
+          <w:lang w:val="vi-VN" w:eastAsia="en-GB"/>
+        </w:rPr>
+      </w:pPr>
+      <w:r>
+        <w:rPr>
+          <w:rFonts w:cs="Times New Roman"/>
+          <w:b/>
+          <w:bCs/>
+          <w:szCs w:val="24"/>
+          <w:lang w:val="vi-VN" w:eastAsia="en-GB"/>
+        </w:rPr>
+        <w:t>c)</w:t>
+      </w:r>
+      <w:r>
+        <w:rPr>
+          <w:rFonts w:cs="Times New Roman"/>
+          <w:szCs w:val="24"/>
+          <w:lang w:val="vi-VN" w:eastAsia="en-GB"/>
+        </w:rPr>
+        <w:t xml:space="preserve"> Điểm </w:t>
+      </w:r>
+      <w:r>
+        <w:rPr>
+          <w:rFonts w:cs="Times New Roman"/>
+          <w:noProof/>
+          <w:position w:val="-14"/>
+          <w:szCs w:val="24"/>
+        </w:rPr>
+        <w:drawing>
+          <wp:inline distT="0" distB="0" distL="0" distR="0" wp14:anchorId="03A15BDB" wp14:editId="604D9C46">
+            <wp:extent cx="762000" cy="257175"/>
+            <wp:effectExtent l="0" t="0" r="0" b="9525"/>
+            <wp:docPr id="1456983551" name="Picture 1456983551"/>
+            <wp:cNvGraphicFramePr>
+              <a:graphicFrameLocks xmlns:a="http://schemas.openxmlformats.org/drawingml/2006/main" noChangeAspect="1"/>
+            </wp:cNvGraphicFramePr>
+            <a:graphic xmlns:a="http://schemas.openxmlformats.org/drawingml/2006/main">
+              <a:graphicData uri="http://schemas.openxmlformats.org/drawingml/2006/picture">
+                <pic:pic xmlns:pic="http://schemas.openxmlformats.org/drawingml/2006/picture">
+                  <pic:nvPicPr>
+                    <pic:cNvPr id="0" name="Picture 1834"/>
+                    <pic:cNvPicPr>
+                      <a:picLocks noChangeAspect="1" noChangeArrowheads="1"/>
+                    </pic:cNvPicPr>
+                  </pic:nvPicPr>
+                  <pic:blipFill>
+                    <a:blip r:embed="rId93" cstate="print">
+                      <a:extLst>
+                        <a:ext uri="{28A0092B-C50C-407E-A947-70E740481C1C}">
+                          <a14:useLocalDpi xmlns:a14="http://schemas.microsoft.com/office/drawing/2010/main" val="0"/>
+                        </a:ext>
+                      </a:extLst>
+                    </a:blip>
+                    <a:srcRect/>
+                    <a:stretch>
+                      <a:fillRect/>
+                    </a:stretch>
+                  </pic:blipFill>
+                  <pic:spPr bwMode="auto">
+                    <a:xfrm>
+                      <a:off x="0" y="0"/>
+                      <a:ext cx="762000" cy="257175"/>
+                    </a:xfrm>
+                    <a:prstGeom prst="rect">
+                      <a:avLst/>
+                    </a:prstGeom>
+                    <a:noFill/>
+                    <a:ln>
+                      <a:noFill/>
+                    </a:ln>
+                  </pic:spPr>
+                </pic:pic>
+              </a:graphicData>
+            </a:graphic>
+          </wp:inline>
+        </w:drawing>
+      </w:r>
+      <w:r>
+        <w:rPr>
+          <w:rFonts w:cs="Times New Roman"/>
+          <w:szCs w:val="24"/>
+          <w:lang w:val="vi-VN" w:eastAsia="en-GB"/>
+        </w:rPr>
+        <w:t xml:space="preserve"> không thuộc đường thẳng </w:t>
+      </w:r>
+      <w:r>
+        <w:rPr>
+          <w:rFonts w:cs="Times New Roman"/>
+          <w:noProof/>
+          <w:position w:val="-6"/>
+          <w:szCs w:val="24"/>
+        </w:rPr>
+        <w:drawing>
+          <wp:inline distT="0" distB="0" distL="0" distR="0" wp14:anchorId="1C7120B8" wp14:editId="3B00ECEA">
+            <wp:extent cx="142875" cy="180975"/>
+            <wp:effectExtent l="0" t="0" r="9525" b="9525"/>
+            <wp:docPr id="1456983550" name="Picture 1456983550"/>
+            <wp:cNvGraphicFramePr>
+              <a:graphicFrameLocks xmlns:a="http://schemas.openxmlformats.org/drawingml/2006/main" noChangeAspect="1"/>
+            </wp:cNvGraphicFramePr>
+            <a:graphic xmlns:a="http://schemas.openxmlformats.org/drawingml/2006/main">
+              <a:graphicData uri="http://schemas.openxmlformats.org/drawingml/2006/picture">
+                <pic:pic xmlns:pic="http://schemas.openxmlformats.org/drawingml/2006/picture">
+                  <pic:nvPicPr>
+                    <pic:cNvPr id="0" name="Picture 1835"/>
+                    <pic:cNvPicPr>
+                      <a:picLocks noChangeAspect="1" noChangeArrowheads="1"/>
+                    </pic:cNvPicPr>
+                  </pic:nvPicPr>
+                  <pic:blipFill>
+                    <a:blip r:embed="rId92" cstate="print">
+                      <a:extLst>
+                        <a:ext uri="{28A0092B-C50C-407E-A947-70E740481C1C}">
+                          <a14:useLocalDpi xmlns:a14="http://schemas.microsoft.com/office/drawing/2010/main" val="0"/>
+                        </a:ext>
+                      </a:extLst>
+                    </a:blip>
+                    <a:srcRect/>
+                    <a:stretch>
+                      <a:fillRect/>
+                    </a:stretch>
+                  </pic:blipFill>
+                  <pic:spPr bwMode="auto">
+                    <a:xfrm>
+                      <a:off x="0" y="0"/>
+                      <a:ext cx="142875" cy="180975"/>
+                    </a:xfrm>
+                    <a:prstGeom prst="rect">
+                      <a:avLst/>
+                    </a:prstGeom>
+                    <a:noFill/>
+                    <a:ln>
+                      <a:noFill/>
+                    </a:ln>
+                  </pic:spPr>
+                </pic:pic>
+              </a:graphicData>
+            </a:graphic>
+          </wp:inline>
+        </w:drawing>
+      </w:r>
+      <w:r>
+        <w:rPr>
+          <w:rFonts w:cs="Times New Roman"/>
+          <w:szCs w:val="24"/>
+          <w:lang w:val="vi-VN"/>
+        </w:rPr>
+        <w:t>.</w:t>
+      </w:r>
+    </w:p>
+    <w:p>
+      <w:pPr>
+        <w:widowControl w:val="0"/>
+        <w:spacing w:before="120" w:after="120" w:line="240" w:lineRule="auto"/>
+        <w:ind w:left="992" w:firstLine="1"/>
+        <w:jc w:val="both"/>
+        <w:rPr>
+          <w:rFonts w:cs="Times New Roman"/>
+          <w:szCs w:val="24"/>
+          <w:lang w:val="vi-VN" w:eastAsia="en-GB"/>
+        </w:rPr>
+      </w:pPr>
+      <w:r>
+        <w:rPr>
+          <w:rFonts w:cs="Times New Roman"/>
+          <w:b/>
+          <w:bCs/>
+          <w:szCs w:val="24"/>
+          <w:lang w:val="vi-VN" w:eastAsia="en-GB"/>
+        </w:rPr>
+        <w:t>d)</w:t>
+      </w:r>
+      <w:r>
+        <w:rPr>
+          <w:rFonts w:cs="Times New Roman"/>
+          <w:szCs w:val="24"/>
+          <w:lang w:val="vi-VN" w:eastAsia="en-GB"/>
+        </w:rPr>
+        <w:t xml:space="preserve"> Phương trình chính tắc của đường thẳng </w:t>
+      </w:r>
+      <w:r>
+        <w:rPr>
+          <w:rFonts w:cs="Times New Roman"/>
+          <w:noProof/>
+          <w:position w:val="-6"/>
+          <w:szCs w:val="24"/>
+        </w:rPr>
+        <w:drawing>
+          <wp:inline distT="0" distB="0" distL="0" distR="0" wp14:anchorId="2D8D9E15" wp14:editId="2CF653A3">
+            <wp:extent cx="142875" cy="180975"/>
+            <wp:effectExtent l="0" t="0" r="9525" b="9525"/>
+            <wp:docPr id="1456983549" name="Picture 1456983549"/>
+            <wp:cNvGraphicFramePr>
+              <a:graphicFrameLocks xmlns:a="http://schemas.openxmlformats.org/drawingml/2006/main" noChangeAspect="1"/>
+            </wp:cNvGraphicFramePr>
+            <a:graphic xmlns:a="http://schemas.openxmlformats.org/drawingml/2006/main">
+              <a:graphicData uri="http://schemas.openxmlformats.org/drawingml/2006/picture">
+                <pic:pic xmlns:pic="http://schemas.openxmlformats.org/drawingml/2006/picture">
+                  <pic:nvPicPr>
+                    <pic:cNvPr id="0" name="Picture 1836"/>
+                    <pic:cNvPicPr>
+                      <a:picLocks noChangeAspect="1" noChangeArrowheads="1"/>
+                    </pic:cNvPicPr>
+                  </pic:nvPicPr>
+                  <pic:blipFill>
+                    <a:blip r:embed="rId94" cstate="print">
+                      <a:extLst>
+                        <a:ext uri="{28A0092B-C50C-407E-A947-70E740481C1C}">
+                          <a14:useLocalDpi xmlns:a14="http://schemas.microsoft.com/office/drawing/2010/main" val="0"/>
+                        </a:ext>
+                      </a:extLst>
+                    </a:blip>
+                    <a:srcRect/>
+                    <a:stretch>
+                      <a:fillRect/>
+                    </a:stretch>
+                  </pic:blipFill>
+                  <pic:spPr bwMode="auto">
+                    <a:xfrm>
+                      <a:off x="0" y="0"/>
+                      <a:ext cx="142875" cy="180975"/>
+                    </a:xfrm>
+                    <a:prstGeom prst="rect">
+                      <a:avLst/>
+                    </a:prstGeom>
+                    <a:noFill/>
+                    <a:ln>
+                      <a:noFill/>
+                    </a:ln>
+                  </pic:spPr>
+                </pic:pic>
+              </a:graphicData>
+            </a:graphic>
+          </wp:inline>
+        </w:drawing>
+      </w:r>
+      <w:r>
+        <w:rPr>
+          <w:rFonts w:cs="Times New Roman"/>
+          <w:szCs w:val="24"/>
+          <w:lang w:val="vi-VN" w:eastAsia="en-GB"/>
+        </w:rPr>
         <w:t xml:space="preserve"> là: </w:t>
       </w:r>
       <w:r>
@@ -8042,7 +8263,7 @@
                     </pic:cNvPicPr>
                   </pic:nvPicPr>
                   <pic:blipFill>
-                    <a:blip r:embed="rId93" cstate="print">
+                    <a:blip r:embed="rId95" cstate="print">
                       <a:extLst>
                         <a:ext uri="{28A0092B-C50C-407E-A947-70E740481C1C}">
                           <a14:useLocalDpi xmlns:a14="http://schemas.microsoft.com/office/drawing/2010/main" val="0"/>
@@ -8153,7 +8374,7 @@
                     </pic:cNvPicPr>
                   </pic:nvPicPr>
                   <pic:blipFill>
-                    <a:blip r:embed="rId94" cstate="print">
+                    <a:blip r:embed="rId96" cstate="print">
                       <a:extLst>
                         <a:ext uri="{28A0092B-C50C-407E-A947-70E740481C1C}">
                           <a14:useLocalDpi xmlns:a14="http://schemas.microsoft.com/office/drawing/2010/main" val="0"/>
@@ -8217,7 +8438,7 @@
                     </pic:cNvPicPr>
                   </pic:nvPicPr>
                   <pic:blipFill>
-                    <a:blip r:embed="rId95" cstate="print">
+                    <a:blip r:embed="rId97" cstate="print">
                       <a:extLst>
                         <a:ext uri="{28A0092B-C50C-407E-A947-70E740481C1C}">
                           <a14:useLocalDpi xmlns:a14="http://schemas.microsoft.com/office/drawing/2010/main" val="0"/>
@@ -8281,7 +8502,7 @@
                     </pic:cNvPicPr>
                   </pic:nvPicPr>
                   <pic:blipFill>
-                    <a:blip r:embed="rId96" cstate="print">
+                    <a:blip r:embed="rId98" cstate="print">
                       <a:extLst>
                         <a:ext uri="{28A0092B-C50C-407E-A947-70E740481C1C}">
                           <a14:useLocalDpi xmlns:a14="http://schemas.microsoft.com/office/drawing/2010/main" val="0"/>
@@ -8345,7 +8566,7 @@
                     </pic:cNvPicPr>
                   </pic:nvPicPr>
                   <pic:blipFill>
-                    <a:blip r:embed="rId97" cstate="print">
+                    <a:blip r:embed="rId99" cstate="print">
                       <a:extLst>
                         <a:ext uri="{28A0092B-C50C-407E-A947-70E740481C1C}">
                           <a14:useLocalDpi xmlns:a14="http://schemas.microsoft.com/office/drawing/2010/main" val="0"/>
@@ -8434,164 +8655,6 @@
                 <pic:pic xmlns:pic="http://schemas.openxmlformats.org/drawingml/2006/picture">
                   <pic:nvPicPr>
                     <pic:cNvPr id="0" name="Picture 1857"/>
-                    <pic:cNvPicPr>
-                      <a:picLocks noChangeAspect="1" noChangeArrowheads="1"/>
-                    </pic:cNvPicPr>
-                  </pic:nvPicPr>
-                  <pic:blipFill>
-                    <a:blip r:embed="rId98" cstate="print">
-                      <a:extLst>
-                        <a:ext uri="{28A0092B-C50C-407E-A947-70E740481C1C}">
-                          <a14:useLocalDpi xmlns:a14="http://schemas.microsoft.com/office/drawing/2010/main" val="0"/>
-                        </a:ext>
-                      </a:extLst>
-                    </a:blip>
-                    <a:srcRect/>
-                    <a:stretch>
-                      <a:fillRect/>
-                    </a:stretch>
-                  </pic:blipFill>
-                  <pic:spPr bwMode="auto">
-                    <a:xfrm>
-                      <a:off x="0" y="0"/>
-                      <a:ext cx="142875" cy="180975"/>
-                    </a:xfrm>
-                    <a:prstGeom prst="rect">
-                      <a:avLst/>
-                    </a:prstGeom>
-                    <a:noFill/>
-                    <a:ln>
-                      <a:noFill/>
-                    </a:ln>
-                  </pic:spPr>
-                </pic:pic>
-              </a:graphicData>
-            </a:graphic>
-          </wp:inline>
-        </w:drawing>
-      </w:r>
-      <w:r>
-        <w:rPr>
-          <w:rFonts w:eastAsia="Calibri" w:cs="Times New Roman"/>
-          <w:szCs w:val="24"/>
-          <w:lang w:val="vi-VN"/>
-        </w:rPr>
-        <w:t xml:space="preserve"> phương trình tham số là </w:t>
-      </w:r>
-      <w:r>
-        <w:rPr>
-          <w:rFonts w:eastAsia="Calibri" w:cs="Times New Roman"/>
-          <w:noProof/>
-          <w:position w:val="-50"/>
-          <w:szCs w:val="24"/>
-        </w:rPr>
-        <w:drawing>
-          <wp:inline distT="0" distB="0" distL="0" distR="0" wp14:anchorId="536BA042" wp14:editId="62EFE981">
-            <wp:extent cx="1352550" cy="704850"/>
-            <wp:effectExtent l="0" t="0" r="0" b="0"/>
-            <wp:docPr id="1456983527" name="Picture 1456983527"/>
-            <wp:cNvGraphicFramePr>
-              <a:graphicFrameLocks xmlns:a="http://schemas.openxmlformats.org/drawingml/2006/main" noChangeAspect="1"/>
-            </wp:cNvGraphicFramePr>
-            <a:graphic xmlns:a="http://schemas.openxmlformats.org/drawingml/2006/main">
-              <a:graphicData uri="http://schemas.openxmlformats.org/drawingml/2006/picture">
-                <pic:pic xmlns:pic="http://schemas.openxmlformats.org/drawingml/2006/picture">
-                  <pic:nvPicPr>
-                    <pic:cNvPr id="0" name="Picture 1858"/>
-                    <pic:cNvPicPr>
-                      <a:picLocks noChangeAspect="1" noChangeArrowheads="1"/>
-                    </pic:cNvPicPr>
-                  </pic:nvPicPr>
-                  <pic:blipFill>
-                    <a:blip r:embed="rId99" cstate="print">
-                      <a:extLst>
-                        <a:ext uri="{28A0092B-C50C-407E-A947-70E740481C1C}">
-                          <a14:useLocalDpi xmlns:a14="http://schemas.microsoft.com/office/drawing/2010/main" val="0"/>
-                        </a:ext>
-                      </a:extLst>
-                    </a:blip>
-                    <a:srcRect/>
-                    <a:stretch>
-                      <a:fillRect/>
-                    </a:stretch>
-                  </pic:blipFill>
-                  <pic:spPr bwMode="auto">
-                    <a:xfrm>
-                      <a:off x="0" y="0"/>
-                      <a:ext cx="1352550" cy="704850"/>
-                    </a:xfrm>
-                    <a:prstGeom prst="rect">
-                      <a:avLst/>
-                    </a:prstGeom>
-                    <a:noFill/>
-                    <a:ln>
-                      <a:noFill/>
-                    </a:ln>
-                  </pic:spPr>
-                </pic:pic>
-              </a:graphicData>
-            </a:graphic>
-          </wp:inline>
-        </w:drawing>
-      </w:r>
-      <w:r>
-        <w:rPr>
-          <w:rFonts w:eastAsia="Calibri" w:cs="Times New Roman"/>
-          <w:szCs w:val="24"/>
-          <w:lang w:val="vi-VN"/>
-        </w:rPr>
-        <w:t>.</w:t>
-      </w:r>
-    </w:p>
-    <w:p>
-      <w:pPr>
-        <w:widowControl w:val="0"/>
-        <w:spacing w:before="120" w:after="120" w:line="240" w:lineRule="auto"/>
-        <w:ind w:left="992" w:firstLine="1"/>
-        <w:jc w:val="both"/>
-        <w:rPr>
-          <w:rFonts w:eastAsia="Calibri" w:cs="Times New Roman"/>
-          <w:szCs w:val="24"/>
-          <w:lang w:val="vi-VN"/>
-        </w:rPr>
-      </w:pPr>
-      <w:r>
-        <w:rPr>
-          <w:rFonts w:eastAsia="Calibri" w:cs="Times New Roman"/>
-          <w:b/>
-          <w:szCs w:val="24"/>
-          <w:lang w:val="vi-VN"/>
-        </w:rPr>
-        <w:t xml:space="preserve">b) </w:t>
-      </w:r>
-      <w:r>
-        <w:rPr>
-          <w:rFonts w:eastAsia="Calibri" w:cs="Times New Roman"/>
-          <w:szCs w:val="24"/>
-          <w:lang w:val="vi-VN"/>
-        </w:rPr>
-        <w:t xml:space="preserve">Đường thẳng </w:t>
-      </w:r>
-      <w:r>
-        <w:rPr>
-          <w:rFonts w:eastAsia="Calibri" w:cs="Times New Roman"/>
-          <w:noProof/>
-          <w:position w:val="-6"/>
-          <w:szCs w:val="24"/>
-        </w:rPr>
-        <w:drawing>
-          <wp:inline distT="0" distB="0" distL="0" distR="0" wp14:anchorId="28DDD86D" wp14:editId="61C489EA">
-            <wp:extent cx="142875" cy="180975"/>
-            <wp:effectExtent l="0" t="0" r="9525" b="9525"/>
-            <wp:docPr id="1456983526" name="Picture 1456983526"/>
-            <wp:cNvGraphicFramePr>
-              <a:graphicFrameLocks xmlns:a="http://schemas.openxmlformats.org/drawingml/2006/main" noChangeAspect="1"/>
-            </wp:cNvGraphicFramePr>
-            <a:graphic xmlns:a="http://schemas.openxmlformats.org/drawingml/2006/main">
-              <a:graphicData uri="http://schemas.openxmlformats.org/drawingml/2006/picture">
-                <pic:pic xmlns:pic="http://schemas.openxmlformats.org/drawingml/2006/picture">
-                  <pic:nvPicPr>
-                    <pic:cNvPr id="0" name="Picture 1859"/>
                     <pic:cNvPicPr>
                       <a:picLocks noChangeAspect="1" noChangeArrowheads="1"/>
                     </pic:cNvPicPr>
@@ -8634,6 +8697,164 @@
           <w:szCs w:val="24"/>
           <w:lang w:val="vi-VN"/>
         </w:rPr>
+        <w:t xml:space="preserve"> phương trình tham số là </w:t>
+      </w:r>
+      <w:r>
+        <w:rPr>
+          <w:rFonts w:eastAsia="Calibri" w:cs="Times New Roman"/>
+          <w:noProof/>
+          <w:position w:val="-50"/>
+          <w:szCs w:val="24"/>
+        </w:rPr>
+        <w:drawing>
+          <wp:inline distT="0" distB="0" distL="0" distR="0" wp14:anchorId="536BA042" wp14:editId="62EFE981">
+            <wp:extent cx="1352550" cy="704850"/>
+            <wp:effectExtent l="0" t="0" r="0" b="0"/>
+            <wp:docPr id="1456983527" name="Picture 1456983527"/>
+            <wp:cNvGraphicFramePr>
+              <a:graphicFrameLocks xmlns:a="http://schemas.openxmlformats.org/drawingml/2006/main" noChangeAspect="1"/>
+            </wp:cNvGraphicFramePr>
+            <a:graphic xmlns:a="http://schemas.openxmlformats.org/drawingml/2006/main">
+              <a:graphicData uri="http://schemas.openxmlformats.org/drawingml/2006/picture">
+                <pic:pic xmlns:pic="http://schemas.openxmlformats.org/drawingml/2006/picture">
+                  <pic:nvPicPr>
+                    <pic:cNvPr id="0" name="Picture 1858"/>
+                    <pic:cNvPicPr>
+                      <a:picLocks noChangeAspect="1" noChangeArrowheads="1"/>
+                    </pic:cNvPicPr>
+                  </pic:nvPicPr>
+                  <pic:blipFill>
+                    <a:blip r:embed="rId101" cstate="print">
+                      <a:extLst>
+                        <a:ext uri="{28A0092B-C50C-407E-A947-70E740481C1C}">
+                          <a14:useLocalDpi xmlns:a14="http://schemas.microsoft.com/office/drawing/2010/main" val="0"/>
+                        </a:ext>
+                      </a:extLst>
+                    </a:blip>
+                    <a:srcRect/>
+                    <a:stretch>
+                      <a:fillRect/>
+                    </a:stretch>
+                  </pic:blipFill>
+                  <pic:spPr bwMode="auto">
+                    <a:xfrm>
+                      <a:off x="0" y="0"/>
+                      <a:ext cx="1352550" cy="704850"/>
+                    </a:xfrm>
+                    <a:prstGeom prst="rect">
+                      <a:avLst/>
+                    </a:prstGeom>
+                    <a:noFill/>
+                    <a:ln>
+                      <a:noFill/>
+                    </a:ln>
+                  </pic:spPr>
+                </pic:pic>
+              </a:graphicData>
+            </a:graphic>
+          </wp:inline>
+        </w:drawing>
+      </w:r>
+      <w:r>
+        <w:rPr>
+          <w:rFonts w:eastAsia="Calibri" w:cs="Times New Roman"/>
+          <w:szCs w:val="24"/>
+          <w:lang w:val="vi-VN"/>
+        </w:rPr>
+        <w:t>.</w:t>
+      </w:r>
+    </w:p>
+    <w:p>
+      <w:pPr>
+        <w:widowControl w:val="0"/>
+        <w:spacing w:before="120" w:after="120" w:line="240" w:lineRule="auto"/>
+        <w:ind w:left="992" w:firstLine="1"/>
+        <w:jc w:val="both"/>
+        <w:rPr>
+          <w:rFonts w:eastAsia="Calibri" w:cs="Times New Roman"/>
+          <w:szCs w:val="24"/>
+          <w:lang w:val="vi-VN"/>
+        </w:rPr>
+      </w:pPr>
+      <w:r>
+        <w:rPr>
+          <w:rFonts w:eastAsia="Calibri" w:cs="Times New Roman"/>
+          <w:b/>
+          <w:szCs w:val="24"/>
+          <w:lang w:val="vi-VN"/>
+        </w:rPr>
+        <w:t xml:space="preserve">b) </w:t>
+      </w:r>
+      <w:r>
+        <w:rPr>
+          <w:rFonts w:eastAsia="Calibri" w:cs="Times New Roman"/>
+          <w:szCs w:val="24"/>
+          <w:lang w:val="vi-VN"/>
+        </w:rPr>
+        <w:t xml:space="preserve">Đường thẳng </w:t>
+      </w:r>
+      <w:r>
+        <w:rPr>
+          <w:rFonts w:eastAsia="Calibri" w:cs="Times New Roman"/>
+          <w:noProof/>
+          <w:position w:val="-6"/>
+          <w:szCs w:val="24"/>
+        </w:rPr>
+        <w:drawing>
+          <wp:inline distT="0" distB="0" distL="0" distR="0" wp14:anchorId="28DDD86D" wp14:editId="61C489EA">
+            <wp:extent cx="142875" cy="180975"/>
+            <wp:effectExtent l="0" t="0" r="9525" b="9525"/>
+            <wp:docPr id="1456983526" name="Picture 1456983526"/>
+            <wp:cNvGraphicFramePr>
+              <a:graphicFrameLocks xmlns:a="http://schemas.openxmlformats.org/drawingml/2006/main" noChangeAspect="1"/>
+            </wp:cNvGraphicFramePr>
+            <a:graphic xmlns:a="http://schemas.openxmlformats.org/drawingml/2006/main">
+              <a:graphicData uri="http://schemas.openxmlformats.org/drawingml/2006/picture">
+                <pic:pic xmlns:pic="http://schemas.openxmlformats.org/drawingml/2006/picture">
+                  <pic:nvPicPr>
+                    <pic:cNvPr id="0" name="Picture 1859"/>
+                    <pic:cNvPicPr>
+                      <a:picLocks noChangeAspect="1" noChangeArrowheads="1"/>
+                    </pic:cNvPicPr>
+                  </pic:nvPicPr>
+                  <pic:blipFill>
+                    <a:blip r:embed="rId102" cstate="print">
+                      <a:extLst>
+                        <a:ext uri="{28A0092B-C50C-407E-A947-70E740481C1C}">
+                          <a14:useLocalDpi xmlns:a14="http://schemas.microsoft.com/office/drawing/2010/main" val="0"/>
+                        </a:ext>
+                      </a:extLst>
+                    </a:blip>
+                    <a:srcRect/>
+                    <a:stretch>
+                      <a:fillRect/>
+                    </a:stretch>
+                  </pic:blipFill>
+                  <pic:spPr bwMode="auto">
+                    <a:xfrm>
+                      <a:off x="0" y="0"/>
+                      <a:ext cx="142875" cy="180975"/>
+                    </a:xfrm>
+                    <a:prstGeom prst="rect">
+                      <a:avLst/>
+                    </a:prstGeom>
+                    <a:noFill/>
+                    <a:ln>
+                      <a:noFill/>
+                    </a:ln>
+                  </pic:spPr>
+                </pic:pic>
+              </a:graphicData>
+            </a:graphic>
+          </wp:inline>
+        </w:drawing>
+      </w:r>
+      <w:r>
+        <w:rPr>
+          <w:rFonts w:eastAsia="Calibri" w:cs="Times New Roman"/>
+          <w:szCs w:val="24"/>
+          <w:lang w:val="vi-VN"/>
+        </w:rPr>
         <w:t xml:space="preserve"> trùng với đường thẳng </w:t>
       </w:r>
       <w:r>
@@ -8661,7 +8882,7 @@
                     </pic:cNvPicPr>
                   </pic:nvPicPr>
                   <pic:blipFill>
-                    <a:blip r:embed="rId101" cstate="print">
+                    <a:blip r:embed="rId103" cstate="print">
                       <a:extLst>
                         <a:ext uri="{28A0092B-C50C-407E-A947-70E740481C1C}">
                           <a14:useLocalDpi xmlns:a14="http://schemas.microsoft.com/office/drawing/2010/main" val="0"/>
@@ -8725,7 +8946,7 @@
                     </pic:cNvPicPr>
                   </pic:nvPicPr>
                   <pic:blipFill>
-                    <a:blip r:embed="rId102" cstate="print">
+                    <a:blip r:embed="rId104" cstate="print">
                       <a:extLst>
                         <a:ext uri="{28A0092B-C50C-407E-A947-70E740481C1C}">
                           <a14:useLocalDpi xmlns:a14="http://schemas.microsoft.com/office/drawing/2010/main" val="0"/>
@@ -8776,6 +8997,7 @@
           <w:szCs w:val="24"/>
           <w:lang w:val="vi-VN"/>
         </w:rPr>
+        <w:lastRenderedPageBreak/>
         <w:t xml:space="preserve">c) </w:t>
       </w:r>
       <w:r>
@@ -8811,7 +9033,7 @@
                     </pic:cNvPicPr>
                   </pic:nvPicPr>
                   <pic:blipFill>
-                    <a:blip r:embed="rId103" cstate="print">
+                    <a:blip r:embed="rId105" cstate="print">
                       <a:extLst>
                         <a:ext uri="{28A0092B-C50C-407E-A947-70E740481C1C}">
                           <a14:useLocalDpi xmlns:a14="http://schemas.microsoft.com/office/drawing/2010/main" val="0"/>
@@ -8875,7 +9097,7 @@
                     </pic:cNvPicPr>
                   </pic:nvPicPr>
                   <pic:blipFill>
-                    <a:blip r:embed="rId104" cstate="print">
+                    <a:blip r:embed="rId106" cstate="print">
                       <a:extLst>
                         <a:ext uri="{28A0092B-C50C-407E-A947-70E740481C1C}">
                           <a14:useLocalDpi xmlns:a14="http://schemas.microsoft.com/office/drawing/2010/main" val="0"/>
@@ -8939,7 +9161,7 @@
                     </pic:cNvPicPr>
                   </pic:nvPicPr>
                   <pic:blipFill>
-                    <a:blip r:embed="rId105" cstate="print">
+                    <a:blip r:embed="rId107" cstate="print">
                       <a:extLst>
                         <a:ext uri="{28A0092B-C50C-407E-A947-70E740481C1C}">
                           <a14:useLocalDpi xmlns:a14="http://schemas.microsoft.com/office/drawing/2010/main" val="0"/>
@@ -9003,7 +9225,7 @@
                     </pic:cNvPicPr>
                   </pic:nvPicPr>
                   <pic:blipFill>
-                    <a:blip r:embed="rId106" cstate="print">
+                    <a:blip r:embed="rId108" cstate="print">
                       <a:extLst>
                         <a:ext uri="{28A0092B-C50C-407E-A947-70E740481C1C}">
                           <a14:useLocalDpi xmlns:a14="http://schemas.microsoft.com/office/drawing/2010/main" val="0"/>
@@ -9097,7 +9319,7 @@
                     </pic:cNvPicPr>
                   </pic:nvPicPr>
                   <pic:blipFill>
-                    <a:blip r:embed="rId107" cstate="print">
+                    <a:blip r:embed="rId109" cstate="print">
                       <a:extLst>
                         <a:ext uri="{28A0092B-C50C-407E-A947-70E740481C1C}">
                           <a14:useLocalDpi xmlns:a14="http://schemas.microsoft.com/office/drawing/2010/main" val="0"/>
@@ -9161,7 +9383,7 @@
                     </pic:cNvPicPr>
                   </pic:nvPicPr>
                   <pic:blipFill>
-                    <a:blip r:embed="rId108" cstate="print">
+                    <a:blip r:embed="rId110" cstate="print">
                       <a:extLst>
                         <a:ext uri="{28A0092B-C50C-407E-A947-70E740481C1C}">
                           <a14:useLocalDpi xmlns:a14="http://schemas.microsoft.com/office/drawing/2010/main" val="0"/>
@@ -9287,7 +9509,7 @@
                     </pic:cNvPicPr>
                   </pic:nvPicPr>
                   <pic:blipFill>
-                    <a:blip r:embed="rId94" cstate="print">
+                    <a:blip r:embed="rId96" cstate="print">
                       <a:extLst>
                         <a:ext uri="{28A0092B-C50C-407E-A947-70E740481C1C}">
                           <a14:useLocalDpi xmlns:a14="http://schemas.microsoft.com/office/drawing/2010/main" val="0"/>
@@ -9351,7 +9573,7 @@
                     </pic:cNvPicPr>
                   </pic:nvPicPr>
                   <pic:blipFill>
-                    <a:blip r:embed="rId109" cstate="print">
+                    <a:blip r:embed="rId111" cstate="print">
                       <a:extLst>
                         <a:ext uri="{28A0092B-C50C-407E-A947-70E740481C1C}">
                           <a14:useLocalDpi xmlns:a14="http://schemas.microsoft.com/office/drawing/2010/main" val="0"/>
@@ -9450,7 +9672,7 @@
                     </pic:cNvPicPr>
                   </pic:nvPicPr>
                   <pic:blipFill>
-                    <a:blip r:embed="rId110" cstate="print">
+                    <a:blip r:embed="rId112" cstate="print">
                       <a:extLst>
                         <a:ext uri="{28A0092B-C50C-407E-A947-70E740481C1C}">
                           <a14:useLocalDpi xmlns:a14="http://schemas.microsoft.com/office/drawing/2010/main" val="0"/>
@@ -9513,7 +9735,7 @@
                     </pic:cNvPicPr>
                   </pic:nvPicPr>
                   <pic:blipFill>
-                    <a:blip r:embed="rId109" cstate="print">
+                    <a:blip r:embed="rId111" cstate="print">
                       <a:extLst>
                         <a:ext uri="{28A0092B-C50C-407E-A947-70E740481C1C}">
                           <a14:useLocalDpi xmlns:a14="http://schemas.microsoft.com/office/drawing/2010/main" val="0"/>
@@ -9576,7 +9798,7 @@
                     </pic:cNvPicPr>
                   </pic:nvPicPr>
                   <pic:blipFill>
-                    <a:blip r:embed="rId111" cstate="print">
+                    <a:blip r:embed="rId113" cstate="print">
                       <a:extLst>
                         <a:ext uri="{28A0092B-C50C-407E-A947-70E740481C1C}">
                           <a14:useLocalDpi xmlns:a14="http://schemas.microsoft.com/office/drawing/2010/main" val="0"/>
@@ -9647,7 +9869,7 @@
                     </pic:cNvPicPr>
                   </pic:nvPicPr>
                   <pic:blipFill>
-                    <a:blip r:embed="rId112" cstate="print">
+                    <a:blip r:embed="rId114" cstate="print">
                       <a:extLst>
                         <a:ext uri="{28A0092B-C50C-407E-A947-70E740481C1C}">
                           <a14:useLocalDpi xmlns:a14="http://schemas.microsoft.com/office/drawing/2010/main" val="0"/>
@@ -9728,212 +9950,6 @@
                 <pic:pic xmlns:pic="http://schemas.openxmlformats.org/drawingml/2006/picture">
                   <pic:nvPicPr>
                     <pic:cNvPr id="0" name="Picture 1898"/>
-                    <pic:cNvPicPr>
-                      <a:picLocks noChangeAspect="1" noChangeArrowheads="1"/>
-                    </pic:cNvPicPr>
-                  </pic:nvPicPr>
-                  <pic:blipFill>
-                    <a:blip r:embed="rId113" cstate="print">
-                      <a:extLst>
-                        <a:ext uri="{28A0092B-C50C-407E-A947-70E740481C1C}">
-                          <a14:useLocalDpi xmlns:a14="http://schemas.microsoft.com/office/drawing/2010/main" val="0"/>
-                        </a:ext>
-                      </a:extLst>
-                    </a:blip>
-                    <a:srcRect/>
-                    <a:stretch>
-                      <a:fillRect/>
-                    </a:stretch>
-                  </pic:blipFill>
-                  <pic:spPr bwMode="auto">
-                    <a:xfrm>
-                      <a:off x="0" y="0"/>
-                      <a:ext cx="142875" cy="161925"/>
-                    </a:xfrm>
-                    <a:prstGeom prst="rect">
-                      <a:avLst/>
-                    </a:prstGeom>
-                    <a:noFill/>
-                    <a:ln>
-                      <a:noFill/>
-                    </a:ln>
-                  </pic:spPr>
-                </pic:pic>
-              </a:graphicData>
-            </a:graphic>
-          </wp:inline>
-        </w:drawing>
-      </w:r>
-      <w:r>
-        <w:rPr>
-          <w:rFonts w:eastAsia="Calibri" w:cs="Times New Roman"/>
-          <w:szCs w:val="24"/>
-          <w:lang w:val="vi-VN"/>
-        </w:rPr>
-        <w:t xml:space="preserve"> là góc giữa đường</w:t>
-      </w:r>
-      <w:r>
-        <w:rPr>
-          <w:rFonts w:eastAsia="Calibri" w:cs="Times New Roman"/>
-          <w:szCs w:val="24"/>
-        </w:rPr>
-        <w:t xml:space="preserve"> thẳng </w:t>
-      </w:r>
-      <w:r>
-        <w:rPr>
-          <w:rFonts w:eastAsia="Calibri" w:cs="Times New Roman"/>
-          <w:noProof/>
-          <w:position w:val="-6"/>
-          <w:szCs w:val="24"/>
-        </w:rPr>
-        <w:drawing>
-          <wp:inline distT="0" distB="0" distL="0" distR="0" wp14:anchorId="5E103923" wp14:editId="2F6CDB31">
-            <wp:extent cx="142875" cy="180975"/>
-            <wp:effectExtent l="0" t="0" r="9525" b="9525"/>
-            <wp:docPr id="1456983486" name="Picture 1456983486"/>
-            <wp:cNvGraphicFramePr>
-              <a:graphicFrameLocks xmlns:a="http://schemas.openxmlformats.org/drawingml/2006/main" noChangeAspect="1"/>
-            </wp:cNvGraphicFramePr>
-            <a:graphic xmlns:a="http://schemas.openxmlformats.org/drawingml/2006/main">
-              <a:graphicData uri="http://schemas.openxmlformats.org/drawingml/2006/picture">
-                <pic:pic xmlns:pic="http://schemas.openxmlformats.org/drawingml/2006/picture">
-                  <pic:nvPicPr>
-                    <pic:cNvPr id="0" name="Picture 1899"/>
-                    <pic:cNvPicPr>
-                      <a:picLocks noChangeAspect="1" noChangeArrowheads="1"/>
-                    </pic:cNvPicPr>
-                  </pic:nvPicPr>
-                  <pic:blipFill>
-                    <a:blip r:embed="rId100" cstate="print">
-                      <a:extLst>
-                        <a:ext uri="{28A0092B-C50C-407E-A947-70E740481C1C}">
-                          <a14:useLocalDpi xmlns:a14="http://schemas.microsoft.com/office/drawing/2010/main" val="0"/>
-                        </a:ext>
-                      </a:extLst>
-                    </a:blip>
-                    <a:srcRect/>
-                    <a:stretch>
-                      <a:fillRect/>
-                    </a:stretch>
-                  </pic:blipFill>
-                  <pic:spPr bwMode="auto">
-                    <a:xfrm>
-                      <a:off x="0" y="0"/>
-                      <a:ext cx="142875" cy="180975"/>
-                    </a:xfrm>
-                    <a:prstGeom prst="rect">
-                      <a:avLst/>
-                    </a:prstGeom>
-                    <a:noFill/>
-                    <a:ln>
-                      <a:noFill/>
-                    </a:ln>
-                  </pic:spPr>
-                </pic:pic>
-              </a:graphicData>
-            </a:graphic>
-          </wp:inline>
-        </w:drawing>
-      </w:r>
-      <w:r>
-        <w:rPr>
-          <w:rFonts w:eastAsia="Calibri" w:cs="Times New Roman"/>
-          <w:szCs w:val="24"/>
-        </w:rPr>
-        <w:t xml:space="preserve"> </w:t>
-      </w:r>
-      <w:r>
-        <w:rPr>
-          <w:rFonts w:eastAsia="Calibri" w:cs="Times New Roman"/>
-          <w:szCs w:val="24"/>
-          <w:lang w:val="vi-VN"/>
-        </w:rPr>
-        <w:t xml:space="preserve">và đường thẳng </w:t>
-      </w:r>
-      <w:r>
-        <w:rPr>
-          <w:rFonts w:eastAsia="Calibri" w:cs="Times New Roman"/>
-          <w:noProof/>
-          <w:position w:val="-24"/>
-          <w:szCs w:val="24"/>
-        </w:rPr>
-        <w:drawing>
-          <wp:inline distT="0" distB="0" distL="0" distR="0" wp14:anchorId="7E21BAB8" wp14:editId="6F050F77">
-            <wp:extent cx="1476375" cy="390525"/>
-            <wp:effectExtent l="0" t="0" r="0" b="9525"/>
-            <wp:docPr id="1456983485" name="Picture 1456983485"/>
-            <wp:cNvGraphicFramePr>
-              <a:graphicFrameLocks xmlns:a="http://schemas.openxmlformats.org/drawingml/2006/main" noChangeAspect="1"/>
-            </wp:cNvGraphicFramePr>
-            <a:graphic xmlns:a="http://schemas.openxmlformats.org/drawingml/2006/main">
-              <a:graphicData uri="http://schemas.openxmlformats.org/drawingml/2006/picture">
-                <pic:pic xmlns:pic="http://schemas.openxmlformats.org/drawingml/2006/picture">
-                  <pic:nvPicPr>
-                    <pic:cNvPr id="0" name="Picture 1900"/>
-                    <pic:cNvPicPr>
-                      <a:picLocks noChangeAspect="1" noChangeArrowheads="1"/>
-                    </pic:cNvPicPr>
-                  </pic:nvPicPr>
-                  <pic:blipFill>
-                    <a:blip r:embed="rId114" cstate="print">
-                      <a:extLst>
-                        <a:ext uri="{28A0092B-C50C-407E-A947-70E740481C1C}">
-                          <a14:useLocalDpi xmlns:a14="http://schemas.microsoft.com/office/drawing/2010/main" val="0"/>
-                        </a:ext>
-                      </a:extLst>
-                    </a:blip>
-                    <a:srcRect/>
-                    <a:stretch>
-                      <a:fillRect/>
-                    </a:stretch>
-                  </pic:blipFill>
-                  <pic:spPr bwMode="auto">
-                    <a:xfrm>
-                      <a:off x="0" y="0"/>
-                      <a:ext cx="1476375" cy="390525"/>
-                    </a:xfrm>
-                    <a:prstGeom prst="rect">
-                      <a:avLst/>
-                    </a:prstGeom>
-                    <a:noFill/>
-                    <a:ln>
-                      <a:noFill/>
-                    </a:ln>
-                  </pic:spPr>
-                </pic:pic>
-              </a:graphicData>
-            </a:graphic>
-          </wp:inline>
-        </w:drawing>
-      </w:r>
-      <w:r>
-        <w:rPr>
-          <w:rFonts w:eastAsia="Calibri" w:cs="Times New Roman"/>
-          <w:szCs w:val="24"/>
-          <w:lang w:val="vi-VN"/>
-        </w:rPr>
-        <w:t xml:space="preserve">. Số đo góc </w:t>
-      </w:r>
-      <w:r>
-        <w:rPr>
-          <w:rFonts w:eastAsia="Calibri" w:cs="Times New Roman"/>
-          <w:noProof/>
-          <w:position w:val="-10"/>
-          <w:szCs w:val="24"/>
-        </w:rPr>
-        <w:drawing>
-          <wp:inline distT="0" distB="0" distL="0" distR="0" wp14:anchorId="302F345A" wp14:editId="1DF83EBC">
-            <wp:extent cx="142875" cy="161925"/>
-            <wp:effectExtent l="0" t="0" r="9525" b="9525"/>
-            <wp:docPr id="1456983484" name="Picture 1456983484"/>
-            <wp:cNvGraphicFramePr>
-              <a:graphicFrameLocks xmlns:a="http://schemas.openxmlformats.org/drawingml/2006/main" noChangeAspect="1"/>
-            </wp:cNvGraphicFramePr>
-            <a:graphic xmlns:a="http://schemas.openxmlformats.org/drawingml/2006/main">
-              <a:graphicData uri="http://schemas.openxmlformats.org/drawingml/2006/picture">
-                <pic:pic xmlns:pic="http://schemas.openxmlformats.org/drawingml/2006/picture">
-                  <pic:nvPicPr>
-                    <pic:cNvPr id="0" name="Picture 1901"/>
                     <pic:cNvPicPr>
                       <a:picLocks noChangeAspect="1" noChangeArrowheads="1"/>
                     </pic:cNvPicPr>
@@ -9976,6 +9992,212 @@
           <w:szCs w:val="24"/>
           <w:lang w:val="vi-VN"/>
         </w:rPr>
+        <w:t xml:space="preserve"> là góc giữa đường</w:t>
+      </w:r>
+      <w:r>
+        <w:rPr>
+          <w:rFonts w:eastAsia="Calibri" w:cs="Times New Roman"/>
+          <w:szCs w:val="24"/>
+        </w:rPr>
+        <w:t xml:space="preserve"> thẳng </w:t>
+      </w:r>
+      <w:r>
+        <w:rPr>
+          <w:rFonts w:eastAsia="Calibri" w:cs="Times New Roman"/>
+          <w:noProof/>
+          <w:position w:val="-6"/>
+          <w:szCs w:val="24"/>
+        </w:rPr>
+        <w:drawing>
+          <wp:inline distT="0" distB="0" distL="0" distR="0" wp14:anchorId="5E103923" wp14:editId="2F6CDB31">
+            <wp:extent cx="142875" cy="180975"/>
+            <wp:effectExtent l="0" t="0" r="9525" b="9525"/>
+            <wp:docPr id="1456983486" name="Picture 1456983486"/>
+            <wp:cNvGraphicFramePr>
+              <a:graphicFrameLocks xmlns:a="http://schemas.openxmlformats.org/drawingml/2006/main" noChangeAspect="1"/>
+            </wp:cNvGraphicFramePr>
+            <a:graphic xmlns:a="http://schemas.openxmlformats.org/drawingml/2006/main">
+              <a:graphicData uri="http://schemas.openxmlformats.org/drawingml/2006/picture">
+                <pic:pic xmlns:pic="http://schemas.openxmlformats.org/drawingml/2006/picture">
+                  <pic:nvPicPr>
+                    <pic:cNvPr id="0" name="Picture 1899"/>
+                    <pic:cNvPicPr>
+                      <a:picLocks noChangeAspect="1" noChangeArrowheads="1"/>
+                    </pic:cNvPicPr>
+                  </pic:nvPicPr>
+                  <pic:blipFill>
+                    <a:blip r:embed="rId102" cstate="print">
+                      <a:extLst>
+                        <a:ext uri="{28A0092B-C50C-407E-A947-70E740481C1C}">
+                          <a14:useLocalDpi xmlns:a14="http://schemas.microsoft.com/office/drawing/2010/main" val="0"/>
+                        </a:ext>
+                      </a:extLst>
+                    </a:blip>
+                    <a:srcRect/>
+                    <a:stretch>
+                      <a:fillRect/>
+                    </a:stretch>
+                  </pic:blipFill>
+                  <pic:spPr bwMode="auto">
+                    <a:xfrm>
+                      <a:off x="0" y="0"/>
+                      <a:ext cx="142875" cy="180975"/>
+                    </a:xfrm>
+                    <a:prstGeom prst="rect">
+                      <a:avLst/>
+                    </a:prstGeom>
+                    <a:noFill/>
+                    <a:ln>
+                      <a:noFill/>
+                    </a:ln>
+                  </pic:spPr>
+                </pic:pic>
+              </a:graphicData>
+            </a:graphic>
+          </wp:inline>
+        </w:drawing>
+      </w:r>
+      <w:r>
+        <w:rPr>
+          <w:rFonts w:eastAsia="Calibri" w:cs="Times New Roman"/>
+          <w:szCs w:val="24"/>
+        </w:rPr>
+        <w:t xml:space="preserve"> </w:t>
+      </w:r>
+      <w:r>
+        <w:rPr>
+          <w:rFonts w:eastAsia="Calibri" w:cs="Times New Roman"/>
+          <w:szCs w:val="24"/>
+          <w:lang w:val="vi-VN"/>
+        </w:rPr>
+        <w:t xml:space="preserve">và đường thẳng </w:t>
+      </w:r>
+      <w:r>
+        <w:rPr>
+          <w:rFonts w:eastAsia="Calibri" w:cs="Times New Roman"/>
+          <w:noProof/>
+          <w:position w:val="-24"/>
+          <w:szCs w:val="24"/>
+        </w:rPr>
+        <w:drawing>
+          <wp:inline distT="0" distB="0" distL="0" distR="0" wp14:anchorId="7E21BAB8" wp14:editId="6F050F77">
+            <wp:extent cx="1476375" cy="390525"/>
+            <wp:effectExtent l="0" t="0" r="0" b="9525"/>
+            <wp:docPr id="1456983485" name="Picture 1456983485"/>
+            <wp:cNvGraphicFramePr>
+              <a:graphicFrameLocks xmlns:a="http://schemas.openxmlformats.org/drawingml/2006/main" noChangeAspect="1"/>
+            </wp:cNvGraphicFramePr>
+            <a:graphic xmlns:a="http://schemas.openxmlformats.org/drawingml/2006/main">
+              <a:graphicData uri="http://schemas.openxmlformats.org/drawingml/2006/picture">
+                <pic:pic xmlns:pic="http://schemas.openxmlformats.org/drawingml/2006/picture">
+                  <pic:nvPicPr>
+                    <pic:cNvPr id="0" name="Picture 1900"/>
+                    <pic:cNvPicPr>
+                      <a:picLocks noChangeAspect="1" noChangeArrowheads="1"/>
+                    </pic:cNvPicPr>
+                  </pic:nvPicPr>
+                  <pic:blipFill>
+                    <a:blip r:embed="rId116" cstate="print">
+                      <a:extLst>
+                        <a:ext uri="{28A0092B-C50C-407E-A947-70E740481C1C}">
+                          <a14:useLocalDpi xmlns:a14="http://schemas.microsoft.com/office/drawing/2010/main" val="0"/>
+                        </a:ext>
+                      </a:extLst>
+                    </a:blip>
+                    <a:srcRect/>
+                    <a:stretch>
+                      <a:fillRect/>
+                    </a:stretch>
+                  </pic:blipFill>
+                  <pic:spPr bwMode="auto">
+                    <a:xfrm>
+                      <a:off x="0" y="0"/>
+                      <a:ext cx="1476375" cy="390525"/>
+                    </a:xfrm>
+                    <a:prstGeom prst="rect">
+                      <a:avLst/>
+                    </a:prstGeom>
+                    <a:noFill/>
+                    <a:ln>
+                      <a:noFill/>
+                    </a:ln>
+                  </pic:spPr>
+                </pic:pic>
+              </a:graphicData>
+            </a:graphic>
+          </wp:inline>
+        </w:drawing>
+      </w:r>
+      <w:r>
+        <w:rPr>
+          <w:rFonts w:eastAsia="Calibri" w:cs="Times New Roman"/>
+          <w:szCs w:val="24"/>
+          <w:lang w:val="vi-VN"/>
+        </w:rPr>
+        <w:t xml:space="preserve">. Số đo góc </w:t>
+      </w:r>
+      <w:r>
+        <w:rPr>
+          <w:rFonts w:eastAsia="Calibri" w:cs="Times New Roman"/>
+          <w:noProof/>
+          <w:position w:val="-10"/>
+          <w:szCs w:val="24"/>
+        </w:rPr>
+        <w:drawing>
+          <wp:inline distT="0" distB="0" distL="0" distR="0" wp14:anchorId="302F345A" wp14:editId="1DF83EBC">
+            <wp:extent cx="142875" cy="161925"/>
+            <wp:effectExtent l="0" t="0" r="9525" b="9525"/>
+            <wp:docPr id="1456983484" name="Picture 1456983484"/>
+            <wp:cNvGraphicFramePr>
+              <a:graphicFrameLocks xmlns:a="http://schemas.openxmlformats.org/drawingml/2006/main" noChangeAspect="1"/>
+            </wp:cNvGraphicFramePr>
+            <a:graphic xmlns:a="http://schemas.openxmlformats.org/drawingml/2006/main">
+              <a:graphicData uri="http://schemas.openxmlformats.org/drawingml/2006/picture">
+                <pic:pic xmlns:pic="http://schemas.openxmlformats.org/drawingml/2006/picture">
+                  <pic:nvPicPr>
+                    <pic:cNvPr id="0" name="Picture 1901"/>
+                    <pic:cNvPicPr>
+                      <a:picLocks noChangeAspect="1" noChangeArrowheads="1"/>
+                    </pic:cNvPicPr>
+                  </pic:nvPicPr>
+                  <pic:blipFill>
+                    <a:blip r:embed="rId117" cstate="print">
+                      <a:extLst>
+                        <a:ext uri="{28A0092B-C50C-407E-A947-70E740481C1C}">
+                          <a14:useLocalDpi xmlns:a14="http://schemas.microsoft.com/office/drawing/2010/main" val="0"/>
+                        </a:ext>
+                      </a:extLst>
+                    </a:blip>
+                    <a:srcRect/>
+                    <a:stretch>
+                      <a:fillRect/>
+                    </a:stretch>
+                  </pic:blipFill>
+                  <pic:spPr bwMode="auto">
+                    <a:xfrm>
+                      <a:off x="0" y="0"/>
+                      <a:ext cx="142875" cy="161925"/>
+                    </a:xfrm>
+                    <a:prstGeom prst="rect">
+                      <a:avLst/>
+                    </a:prstGeom>
+                    <a:noFill/>
+                    <a:ln>
+                      <a:noFill/>
+                    </a:ln>
+                  </pic:spPr>
+                </pic:pic>
+              </a:graphicData>
+            </a:graphic>
+          </wp:inline>
+        </w:drawing>
+      </w:r>
+      <w:r>
+        <w:rPr>
+          <w:rFonts w:eastAsia="Calibri" w:cs="Times New Roman"/>
+          <w:szCs w:val="24"/>
+          <w:lang w:val="vi-VN"/>
+        </w:rPr>
         <w:t xml:space="preserve"> nhỏ hơn góc </w:t>
       </w:r>
       <w:r>
@@ -10003,7 +10225,7 @@
                     </pic:cNvPicPr>
                   </pic:nvPicPr>
                   <pic:blipFill>
-                    <a:blip r:embed="rId116" cstate="print">
+                    <a:blip r:embed="rId118" cstate="print">
                       <a:extLst>
                         <a:ext uri="{28A0092B-C50C-407E-A947-70E740481C1C}">
                           <a14:useLocalDpi xmlns:a14="http://schemas.microsoft.com/office/drawing/2010/main" val="0"/>
@@ -10097,7 +10319,7 @@
                     </pic:cNvPicPr>
                   </pic:nvPicPr>
                   <pic:blipFill>
-                    <a:blip r:embed="rId117" cstate="print">
+                    <a:blip r:embed="rId119" cstate="print">
                       <a:extLst>
                         <a:ext uri="{28A0092B-C50C-407E-A947-70E740481C1C}">
                           <a14:useLocalDpi xmlns:a14="http://schemas.microsoft.com/office/drawing/2010/main" val="0"/>
@@ -10161,7 +10383,7 @@
                     </pic:cNvPicPr>
                   </pic:nvPicPr>
                   <pic:blipFill>
-                    <a:blip r:embed="rId118" cstate="print">
+                    <a:blip r:embed="rId120" cstate="print">
                       <a:extLst>
                         <a:ext uri="{28A0092B-C50C-407E-A947-70E740481C1C}">
                           <a14:useLocalDpi xmlns:a14="http://schemas.microsoft.com/office/drawing/2010/main" val="0"/>
@@ -10225,7 +10447,7 @@
                     </pic:cNvPicPr>
                   </pic:nvPicPr>
                   <pic:blipFill>
-                    <a:blip r:embed="rId119" cstate="print">
+                    <a:blip r:embed="rId121" cstate="print">
                       <a:extLst>
                         <a:ext uri="{28A0092B-C50C-407E-A947-70E740481C1C}">
                           <a14:useLocalDpi xmlns:a14="http://schemas.microsoft.com/office/drawing/2010/main" val="0"/>
@@ -10289,7 +10511,7 @@
                     </pic:cNvPicPr>
                   </pic:nvPicPr>
                   <pic:blipFill>
-                    <a:blip r:embed="rId120" cstate="print">
+                    <a:blip r:embed="rId122" cstate="print">
                       <a:extLst>
                         <a:ext uri="{28A0092B-C50C-407E-A947-70E740481C1C}">
                           <a14:useLocalDpi xmlns:a14="http://schemas.microsoft.com/office/drawing/2010/main" val="0"/>
@@ -10353,7 +10575,7 @@
                     </pic:cNvPicPr>
                   </pic:nvPicPr>
                   <pic:blipFill>
-                    <a:blip r:embed="rId121" cstate="print">
+                    <a:blip r:embed="rId123" cstate="print">
                       <a:extLst>
                         <a:ext uri="{28A0092B-C50C-407E-A947-70E740481C1C}">
                           <a14:useLocalDpi xmlns:a14="http://schemas.microsoft.com/office/drawing/2010/main" val="0"/>
@@ -10417,7 +10639,7 @@
                     </pic:cNvPicPr>
                   </pic:nvPicPr>
                   <pic:blipFill>
-                    <a:blip r:embed="rId122" cstate="print">
+                    <a:blip r:embed="rId124" cstate="print">
                       <a:extLst>
                         <a:ext uri="{28A0092B-C50C-407E-A947-70E740481C1C}">
                           <a14:useLocalDpi xmlns:a14="http://schemas.microsoft.com/office/drawing/2010/main" val="0"/>
@@ -10519,7 +10741,7 @@
                     </pic:cNvPicPr>
                   </pic:nvPicPr>
                   <pic:blipFill>
-                    <a:blip r:embed="rId123" cstate="print">
+                    <a:blip r:embed="rId125" cstate="print">
                       <a:extLst>
                         <a:ext uri="{28A0092B-C50C-407E-A947-70E740481C1C}">
                           <a14:useLocalDpi xmlns:a14="http://schemas.microsoft.com/office/drawing/2010/main" val="0"/>
@@ -10583,7 +10805,7 @@
                     </pic:cNvPicPr>
                   </pic:nvPicPr>
                   <pic:blipFill>
-                    <a:blip r:embed="rId124" cstate="print">
+                    <a:blip r:embed="rId126" cstate="print">
                       <a:extLst>
                         <a:ext uri="{28A0092B-C50C-407E-A947-70E740481C1C}">
                           <a14:useLocalDpi xmlns:a14="http://schemas.microsoft.com/office/drawing/2010/main" val="0"/>
@@ -10647,7 +10869,7 @@
                     </pic:cNvPicPr>
                   </pic:nvPicPr>
                   <pic:blipFill>
-                    <a:blip r:embed="rId125" cstate="print">
+                    <a:blip r:embed="rId127" cstate="print">
                       <a:extLst>
                         <a:ext uri="{28A0092B-C50C-407E-A947-70E740481C1C}">
                           <a14:useLocalDpi xmlns:a14="http://schemas.microsoft.com/office/drawing/2010/main" val="0"/>
@@ -10711,7 +10933,7 @@
                     </pic:cNvPicPr>
                   </pic:nvPicPr>
                   <pic:blipFill>
-                    <a:blip r:embed="rId126" cstate="print">
+                    <a:blip r:embed="rId128" cstate="print">
                       <a:extLst>
                         <a:ext uri="{28A0092B-C50C-407E-A947-70E740481C1C}">
                           <a14:useLocalDpi xmlns:a14="http://schemas.microsoft.com/office/drawing/2010/main" val="0"/>
@@ -10775,7 +10997,7 @@
                     </pic:cNvPicPr>
                   </pic:nvPicPr>
                   <pic:blipFill>
-                    <a:blip r:embed="rId123" cstate="print">
+                    <a:blip r:embed="rId125" cstate="print">
                       <a:extLst>
                         <a:ext uri="{28A0092B-C50C-407E-A947-70E740481C1C}">
                           <a14:useLocalDpi xmlns:a14="http://schemas.microsoft.com/office/drawing/2010/main" val="0"/>
@@ -10860,7 +11082,7 @@
                     </pic:cNvPicPr>
                   </pic:nvPicPr>
                   <pic:blipFill>
-                    <a:blip r:embed="rId127" cstate="print">
+                    <a:blip r:embed="rId129" cstate="print">
                       <a:extLst>
                         <a:ext uri="{28A0092B-C50C-407E-A947-70E740481C1C}">
                           <a14:useLocalDpi xmlns:a14="http://schemas.microsoft.com/office/drawing/2010/main" val="0"/>
@@ -10984,7 +11206,7 @@
                     </pic:cNvPicPr>
                   </pic:nvPicPr>
                   <pic:blipFill>
-                    <a:blip r:embed="rId128" cstate="print">
+                    <a:blip r:embed="rId130" cstate="print">
                       <a:extLst>
                         <a:ext uri="{28A0092B-C50C-407E-A947-70E740481C1C}">
                           <a14:useLocalDpi xmlns:a14="http://schemas.microsoft.com/office/drawing/2010/main" val="0"/>
@@ -11048,7 +11270,7 @@
                     </pic:cNvPicPr>
                   </pic:nvPicPr>
                   <pic:blipFill>
-                    <a:blip r:embed="rId129" cstate="print">
+                    <a:blip r:embed="rId131" cstate="print">
                       <a:extLst>
                         <a:ext uri="{28A0092B-C50C-407E-A947-70E740481C1C}">
                           <a14:useLocalDpi xmlns:a14="http://schemas.microsoft.com/office/drawing/2010/main" val="0"/>
@@ -11112,7 +11334,7 @@
                     </pic:cNvPicPr>
                   </pic:nvPicPr>
                   <pic:blipFill>
-                    <a:blip r:embed="rId130" cstate="print">
+                    <a:blip r:embed="rId132" cstate="print">
                       <a:extLst>
                         <a:ext uri="{28A0092B-C50C-407E-A947-70E740481C1C}">
                           <a14:useLocalDpi xmlns:a14="http://schemas.microsoft.com/office/drawing/2010/main" val="0"/>
@@ -11176,7 +11398,7 @@
                     </pic:cNvPicPr>
                   </pic:nvPicPr>
                   <pic:blipFill>
-                    <a:blip r:embed="rId131" cstate="print">
+                    <a:blip r:embed="rId133" cstate="print">
                       <a:extLst>
                         <a:ext uri="{28A0092B-C50C-407E-A947-70E740481C1C}">
                           <a14:useLocalDpi xmlns:a14="http://schemas.microsoft.com/office/drawing/2010/main" val="0"/>
@@ -11240,7 +11462,7 @@
                     </pic:cNvPicPr>
                   </pic:nvPicPr>
                   <pic:blipFill>
-                    <a:blip r:embed="rId132" cstate="print">
+                    <a:blip r:embed="rId134" cstate="print">
                       <a:extLst>
                         <a:ext uri="{28A0092B-C50C-407E-A947-70E740481C1C}">
                           <a14:useLocalDpi xmlns:a14="http://schemas.microsoft.com/office/drawing/2010/main" val="0"/>
@@ -11304,7 +11526,7 @@
                     </pic:cNvPicPr>
                   </pic:nvPicPr>
                   <pic:blipFill>
-                    <a:blip r:embed="rId133" cstate="print">
+                    <a:blip r:embed="rId135" cstate="print">
                       <a:extLst>
                         <a:ext uri="{28A0092B-C50C-407E-A947-70E740481C1C}">
                           <a14:useLocalDpi xmlns:a14="http://schemas.microsoft.com/office/drawing/2010/main" val="0"/>
@@ -11368,7 +11590,7 @@
                     </pic:cNvPicPr>
                   </pic:nvPicPr>
                   <pic:blipFill>
-                    <a:blip r:embed="rId134" cstate="print">
+                    <a:blip r:embed="rId136" cstate="print">
                       <a:extLst>
                         <a:ext uri="{28A0092B-C50C-407E-A947-70E740481C1C}">
                           <a14:useLocalDpi xmlns:a14="http://schemas.microsoft.com/office/drawing/2010/main" val="0"/>
@@ -11432,7 +11654,7 @@
                     </pic:cNvPicPr>
                   </pic:nvPicPr>
                   <pic:blipFill>
-                    <a:blip r:embed="rId135" cstate="print">
+                    <a:blip r:embed="rId137" cstate="print">
                       <a:extLst>
                         <a:ext uri="{28A0092B-C50C-407E-A947-70E740481C1C}">
                           <a14:useLocalDpi xmlns:a14="http://schemas.microsoft.com/office/drawing/2010/main" val="0"/>
@@ -11496,7 +11718,7 @@
                     </pic:cNvPicPr>
                   </pic:nvPicPr>
                   <pic:blipFill>
-                    <a:blip r:embed="rId136" cstate="print">
+                    <a:blip r:embed="rId138" cstate="print">
                       <a:extLst>
                         <a:ext uri="{28A0092B-C50C-407E-A947-70E740481C1C}">
                           <a14:useLocalDpi xmlns:a14="http://schemas.microsoft.com/office/drawing/2010/main" val="0"/>
@@ -11582,7 +11804,7 @@
                     </pic:cNvPicPr>
                   </pic:nvPicPr>
                   <pic:blipFill>
-                    <a:blip r:embed="rId137" cstate="print">
+                    <a:blip r:embed="rId139" cstate="print">
                       <a:extLst>
                         <a:ext uri="{28A0092B-C50C-407E-A947-70E740481C1C}">
                           <a14:useLocalDpi xmlns:a14="http://schemas.microsoft.com/office/drawing/2010/main" val="0"/>
@@ -11646,7 +11868,7 @@
                     </pic:cNvPicPr>
                   </pic:nvPicPr>
                   <pic:blipFill>
-                    <a:blip r:embed="rId138" cstate="print">
+                    <a:blip r:embed="rId140" cstate="print">
                       <a:extLst>
                         <a:ext uri="{28A0092B-C50C-407E-A947-70E740481C1C}">
                           <a14:useLocalDpi xmlns:a14="http://schemas.microsoft.com/office/drawing/2010/main" val="0"/>
@@ -11740,7 +11962,7 @@
                     </pic:cNvPicPr>
                   </pic:nvPicPr>
                   <pic:blipFill>
-                    <a:blip r:embed="rId139" cstate="print">
+                    <a:blip r:embed="rId141" cstate="print">
                       <a:extLst>
                         <a:ext uri="{28A0092B-C50C-407E-A947-70E740481C1C}">
                           <a14:useLocalDpi xmlns:a14="http://schemas.microsoft.com/office/drawing/2010/main" val="0"/>
@@ -11834,7 +12056,7 @@
                     </pic:cNvPicPr>
                   </pic:nvPicPr>
                   <pic:blipFill>
-                    <a:blip r:embed="rId140" cstate="print">
+                    <a:blip r:embed="rId142" cstate="print">
                       <a:extLst>
                         <a:ext uri="{28A0092B-C50C-407E-A947-70E740481C1C}">
                           <a14:useLocalDpi xmlns:a14="http://schemas.microsoft.com/office/drawing/2010/main" val="0"/>
@@ -11898,7 +12120,7 @@
                     </pic:cNvPicPr>
                   </pic:nvPicPr>
                   <pic:blipFill>
-                    <a:blip r:embed="rId141" cstate="print">
+                    <a:blip r:embed="rId143" cstate="print">
                       <a:extLst>
                         <a:ext uri="{28A0092B-C50C-407E-A947-70E740481C1C}">
                           <a14:useLocalDpi xmlns:a14="http://schemas.microsoft.com/office/drawing/2010/main" val="0"/>
@@ -11962,7 +12184,7 @@
                     </pic:cNvPicPr>
                   </pic:nvPicPr>
                   <pic:blipFill>
-                    <a:blip r:embed="rId142" cstate="print">
+                    <a:blip r:embed="rId144" cstate="print">
                       <a:extLst>
                         <a:ext uri="{28A0092B-C50C-407E-A947-70E740481C1C}">
                           <a14:useLocalDpi xmlns:a14="http://schemas.microsoft.com/office/drawing/2010/main" val="0"/>
@@ -12056,7 +12278,7 @@
                     </pic:cNvPicPr>
                   </pic:nvPicPr>
                   <pic:blipFill>
-                    <a:blip r:embed="rId143" cstate="print">
+                    <a:blip r:embed="rId145" cstate="print">
                       <a:extLst>
                         <a:ext uri="{28A0092B-C50C-407E-A947-70E740481C1C}">
                           <a14:useLocalDpi xmlns:a14="http://schemas.microsoft.com/office/drawing/2010/main" val="0"/>
@@ -12120,7 +12342,7 @@
                     </pic:cNvPicPr>
                   </pic:nvPicPr>
                   <pic:blipFill>
-                    <a:blip r:embed="rId144" cstate="print">
+                    <a:blip r:embed="rId146" cstate="print">
                       <a:extLst>
                         <a:ext uri="{28A0092B-C50C-407E-A947-70E740481C1C}">
                           <a14:useLocalDpi xmlns:a14="http://schemas.microsoft.com/office/drawing/2010/main" val="0"/>
@@ -12184,7 +12406,7 @@
                     </pic:cNvPicPr>
                   </pic:nvPicPr>
                   <pic:blipFill>
-                    <a:blip r:embed="rId145" cstate="print">
+                    <a:blip r:embed="rId147" cstate="print">
                       <a:extLst>
                         <a:ext uri="{28A0092B-C50C-407E-A947-70E740481C1C}">
                           <a14:useLocalDpi xmlns:a14="http://schemas.microsoft.com/office/drawing/2010/main" val="0"/>
@@ -12401,7 +12623,7 @@
                     </pic:cNvPicPr>
                   </pic:nvPicPr>
                   <pic:blipFill>
-                    <a:blip r:embed="rId146" cstate="print">
+                    <a:blip r:embed="rId148" cstate="print">
                       <a:extLst>
                         <a:ext uri="{28A0092B-C50C-407E-A947-70E740481C1C}">
                           <a14:useLocalDpi xmlns:a14="http://schemas.microsoft.com/office/drawing/2010/main" val="0"/>
@@ -12465,7 +12687,7 @@
                     </pic:cNvPicPr>
                   </pic:nvPicPr>
                   <pic:blipFill>
-                    <a:blip r:embed="rId147" cstate="print">
+                    <a:blip r:embed="rId149" cstate="print">
                       <a:extLst>
                         <a:ext uri="{28A0092B-C50C-407E-A947-70E740481C1C}">
                           <a14:useLocalDpi xmlns:a14="http://schemas.microsoft.com/office/drawing/2010/main" val="0"/>
@@ -12529,7 +12751,7 @@
                     </pic:cNvPicPr>
                   </pic:nvPicPr>
                   <pic:blipFill>
-                    <a:blip r:embed="rId148" cstate="print">
+                    <a:blip r:embed="rId150" cstate="print">
                       <a:extLst>
                         <a:ext uri="{28A0092B-C50C-407E-A947-70E740481C1C}">
                           <a14:useLocalDpi xmlns:a14="http://schemas.microsoft.com/office/drawing/2010/main" val="0"/>
@@ -12601,7 +12823,7 @@
                     </pic:cNvPicPr>
                   </pic:nvPicPr>
                   <pic:blipFill>
-                    <a:blip r:embed="rId149" cstate="print">
+                    <a:blip r:embed="rId151" cstate="print">
                       <a:extLst>
                         <a:ext uri="{28A0092B-C50C-407E-A947-70E740481C1C}">
                           <a14:useLocalDpi xmlns:a14="http://schemas.microsoft.com/office/drawing/2010/main" val="0"/>
@@ -12712,7 +12934,7 @@
                     </pic:cNvPicPr>
                   </pic:nvPicPr>
                   <pic:blipFill>
-                    <a:blip r:embed="rId150" cstate="print">
+                    <a:blip r:embed="rId152" cstate="print">
                       <a:extLst>
                         <a:ext uri="{28A0092B-C50C-407E-A947-70E740481C1C}">
                           <a14:useLocalDpi xmlns:a14="http://schemas.microsoft.com/office/drawing/2010/main" val="0"/>
@@ -12776,7 +12998,7 @@
                     </pic:cNvPicPr>
                   </pic:nvPicPr>
                   <pic:blipFill>
-                    <a:blip r:embed="rId151" cstate="print">
+                    <a:blip r:embed="rId153" cstate="print">
                       <a:extLst>
                         <a:ext uri="{28A0092B-C50C-407E-A947-70E740481C1C}">
                           <a14:useLocalDpi xmlns:a14="http://schemas.microsoft.com/office/drawing/2010/main" val="0"/>
@@ -12840,7 +13062,7 @@
                     </pic:cNvPicPr>
                   </pic:nvPicPr>
                   <pic:blipFill>
-                    <a:blip r:embed="rId152" cstate="print">
+                    <a:blip r:embed="rId154" cstate="print">
                       <a:extLst>
                         <a:ext uri="{28A0092B-C50C-407E-A947-70E740481C1C}">
                           <a14:useLocalDpi xmlns:a14="http://schemas.microsoft.com/office/drawing/2010/main" val="0"/>
@@ -12904,7 +13126,7 @@
                     </pic:cNvPicPr>
                   </pic:nvPicPr>
                   <pic:blipFill>
-                    <a:blip r:embed="rId153" cstate="print">
+                    <a:blip r:embed="rId155" cstate="print">
                       <a:extLst>
                         <a:ext uri="{28A0092B-C50C-407E-A947-70E740481C1C}">
                           <a14:useLocalDpi xmlns:a14="http://schemas.microsoft.com/office/drawing/2010/main" val="0"/>
@@ -12968,7 +13190,7 @@
                     </pic:cNvPicPr>
                   </pic:nvPicPr>
                   <pic:blipFill>
-                    <a:blip r:embed="rId154" cstate="print">
+                    <a:blip r:embed="rId156" cstate="print">
                       <a:extLst>
                         <a:ext uri="{28A0092B-C50C-407E-A947-70E740481C1C}">
                           <a14:useLocalDpi xmlns:a14="http://schemas.microsoft.com/office/drawing/2010/main" val="0"/>
@@ -13032,7 +13254,7 @@
                     </pic:cNvPicPr>
                   </pic:nvPicPr>
                   <pic:blipFill>
-                    <a:blip r:embed="rId155" cstate="print">
+                    <a:blip r:embed="rId157" cstate="print">
                       <a:extLst>
                         <a:ext uri="{28A0092B-C50C-407E-A947-70E740481C1C}">
                           <a14:useLocalDpi xmlns:a14="http://schemas.microsoft.com/office/drawing/2010/main" val="0"/>
@@ -13096,7 +13318,7 @@
                     </pic:cNvPicPr>
                   </pic:nvPicPr>
                   <pic:blipFill>
-                    <a:blip r:embed="rId156" cstate="print">
+                    <a:blip r:embed="rId158" cstate="print">
                       <a:extLst>
                         <a:ext uri="{28A0092B-C50C-407E-A947-70E740481C1C}">
                           <a14:useLocalDpi xmlns:a14="http://schemas.microsoft.com/office/drawing/2010/main" val="0"/>
@@ -13168,7 +13390,7 @@
                     </pic:cNvPicPr>
                   </pic:nvPicPr>
                   <pic:blipFill>
-                    <a:blip r:embed="rId153" cstate="print">
+                    <a:blip r:embed="rId155" cstate="print">
                       <a:extLst>
                         <a:ext uri="{28A0092B-C50C-407E-A947-70E740481C1C}">
                           <a14:useLocalDpi xmlns:a14="http://schemas.microsoft.com/office/drawing/2010/main" val="0"/>
@@ -13232,7 +13454,7 @@
                     </pic:cNvPicPr>
                   </pic:nvPicPr>
                   <pic:blipFill>
-                    <a:blip r:embed="rId157" cstate="print">
+                    <a:blip r:embed="rId159" cstate="print">
                       <a:extLst>
                         <a:ext uri="{28A0092B-C50C-407E-A947-70E740481C1C}">
                           <a14:useLocalDpi xmlns:a14="http://schemas.microsoft.com/office/drawing/2010/main" val="0"/>
@@ -13299,7 +13521,6 @@
         <w:rPr>
           <w:rFonts w:cs="Times New Roman"/>
           <w:szCs w:val="24"/>
-          <w:lang w:val="vi-VN"/>
         </w:rPr>
       </w:pPr>
       <w:r>
@@ -13345,7 +13566,7 @@
                     </pic:cNvPicPr>
                   </pic:nvPicPr>
                   <pic:blipFill>
-                    <a:blip r:embed="rId158" cstate="print">
+                    <a:blip r:embed="rId160" cstate="print">
                       <a:extLst>
                         <a:ext uri="{28A0092B-C50C-407E-A947-70E740481C1C}">
                           <a14:useLocalDpi xmlns:a14="http://schemas.microsoft.com/office/drawing/2010/main" val="0"/>
@@ -13409,7 +13630,7 @@
                     </pic:cNvPicPr>
                   </pic:nvPicPr>
                   <pic:blipFill>
-                    <a:blip r:embed="rId159" cstate="print">
+                    <a:blip r:embed="rId161" cstate="print">
                       <a:extLst>
                         <a:ext uri="{28A0092B-C50C-407E-A947-70E740481C1C}">
                           <a14:useLocalDpi xmlns:a14="http://schemas.microsoft.com/office/drawing/2010/main" val="0"/>
@@ -13473,7 +13694,7 @@
                     </pic:cNvPicPr>
                   </pic:nvPicPr>
                   <pic:blipFill>
-                    <a:blip r:embed="rId160" cstate="print">
+                    <a:blip r:embed="rId162" cstate="print">
                       <a:extLst>
                         <a:ext uri="{28A0092B-C50C-407E-A947-70E740481C1C}">
                           <a14:useLocalDpi xmlns:a14="http://schemas.microsoft.com/office/drawing/2010/main" val="0"/>
@@ -13537,7 +13758,7 @@
                     </pic:cNvPicPr>
                   </pic:nvPicPr>
                   <pic:blipFill>
-                    <a:blip r:embed="rId161" cstate="print">
+                    <a:blip r:embed="rId163" cstate="print">
                       <a:extLst>
                         <a:ext uri="{28A0092B-C50C-407E-A947-70E740481C1C}">
                           <a14:useLocalDpi xmlns:a14="http://schemas.microsoft.com/office/drawing/2010/main" val="0"/>
@@ -13601,7 +13822,7 @@
                     </pic:cNvPicPr>
                   </pic:nvPicPr>
                   <pic:blipFill>
-                    <a:blip r:embed="rId161" cstate="print">
+                    <a:blip r:embed="rId163" cstate="print">
                       <a:extLst>
                         <a:ext uri="{28A0092B-C50C-407E-A947-70E740481C1C}">
                           <a14:useLocalDpi xmlns:a14="http://schemas.microsoft.com/office/drawing/2010/main" val="0"/>
@@ -13665,7 +13886,7 @@
                     </pic:cNvPicPr>
                   </pic:nvPicPr>
                   <pic:blipFill>
-                    <a:blip r:embed="rId162" cstate="print">
+                    <a:blip r:embed="rId164" cstate="print">
                       <a:extLst>
                         <a:ext uri="{28A0092B-C50C-407E-A947-70E740481C1C}">
                           <a14:useLocalDpi xmlns:a14="http://schemas.microsoft.com/office/drawing/2010/main" val="0"/>
@@ -13729,7 +13950,7 @@
                     </pic:cNvPicPr>
                   </pic:nvPicPr>
                   <pic:blipFill>
-                    <a:blip r:embed="rId163" cstate="print">
+                    <a:blip r:embed="rId165" cstate="print">
                       <a:extLst>
                         <a:ext uri="{28A0092B-C50C-407E-A947-70E740481C1C}">
                           <a14:useLocalDpi xmlns:a14="http://schemas.microsoft.com/office/drawing/2010/main" val="0"/>
@@ -13779,6 +14000,61 @@
         <w:jc w:val="both"/>
         <w:rPr>
           <w:rFonts w:cs="Times New Roman"/>
+          <w:szCs w:val="24"/>
+        </w:rPr>
+      </w:pPr>
+      <w:r>
+        <w:rPr>
+          <w:rFonts w:cs="Times New Roman"/>
+          <w:szCs w:val="24"/>
+        </w:rPr>
+        <w:drawing>
+          <wp:inline distT="0" distB="0" distL="0" distR="0" wp14:anchorId="64F614B8" wp14:editId="08D5843B">
+            <wp:extent cx="3271837" cy="2684434"/>
+            <wp:effectExtent l="0" t="0" r="5080" b="1905"/>
+            <wp:docPr id="812681576" name="Hình ảnh 1"/>
+            <wp:cNvGraphicFramePr>
+              <a:graphicFrameLocks xmlns:a="http://schemas.openxmlformats.org/drawingml/2006/main" noChangeAspect="1"/>
+            </wp:cNvGraphicFramePr>
+            <a:graphic xmlns:a="http://schemas.openxmlformats.org/drawingml/2006/main">
+              <a:graphicData uri="http://schemas.openxmlformats.org/drawingml/2006/picture">
+                <pic:pic xmlns:pic="http://schemas.openxmlformats.org/drawingml/2006/picture">
+                  <pic:nvPicPr>
+                    <pic:cNvPr id="812681576" name=""/>
+                    <pic:cNvPicPr/>
+                  </pic:nvPicPr>
+                  <pic:blipFill>
+                    <a:blip r:embed="rId166"/>
+                    <a:stretch>
+                      <a:fillRect/>
+                    </a:stretch>
+                  </pic:blipFill>
+                  <pic:spPr>
+                    <a:xfrm>
+                      <a:off x="0" y="0"/>
+                      <a:ext cx="3275538" cy="2687470"/>
+                    </a:xfrm>
+                    <a:prstGeom prst="rect">
+                      <a:avLst/>
+                    </a:prstGeom>
+                  </pic:spPr>
+                </pic:pic>
+              </a:graphicData>
+            </a:graphic>
+          </wp:inline>
+        </w:drawing>
+      </w:r>
+    </w:p>
+    <w:p>
+      <w:pPr>
+        <w:tabs>
+          <w:tab w:val="left" w:pos="992"/>
+        </w:tabs>
+        <w:spacing w:before="120" w:after="120" w:line="240" w:lineRule="auto"/>
+        <w:ind w:left="992" w:hanging="992"/>
+        <w:jc w:val="both"/>
+        <w:rPr>
+          <w:rFonts w:cs="Times New Roman"/>
           <w:b/>
           <w:bCs/>
           <w:szCs w:val="24"/>
@@ -13845,7 +14121,7 @@
                     </pic:cNvPicPr>
                   </pic:nvPicPr>
                   <pic:blipFill>
-                    <a:blip r:embed="rId164" cstate="print">
+                    <a:blip r:embed="rId167" cstate="print">
                       <a:extLst>
                         <a:ext uri="{28A0092B-C50C-407E-A947-70E740481C1C}">
                           <a14:useLocalDpi xmlns:a14="http://schemas.microsoft.com/office/drawing/2010/main" val="0"/>
@@ -13909,7 +14185,7 @@
                     </pic:cNvPicPr>
                   </pic:nvPicPr>
                   <pic:blipFill>
-                    <a:blip r:embed="rId165" cstate="print">
+                    <a:blip r:embed="rId168" cstate="print">
                       <a:extLst>
                         <a:ext uri="{28A0092B-C50C-407E-A947-70E740481C1C}">
                           <a14:useLocalDpi xmlns:a14="http://schemas.microsoft.com/office/drawing/2010/main" val="0"/>
@@ -13973,7 +14249,7 @@
                     </pic:cNvPicPr>
                   </pic:nvPicPr>
                   <pic:blipFill>
-                    <a:blip r:embed="rId166" cstate="print">
+                    <a:blip r:embed="rId169" cstate="print">
                       <a:extLst>
                         <a:ext uri="{28A0092B-C50C-407E-A947-70E740481C1C}">
                           <a14:useLocalDpi xmlns:a14="http://schemas.microsoft.com/office/drawing/2010/main" val="0"/>
@@ -14037,7 +14313,7 @@
                     </pic:cNvPicPr>
                   </pic:nvPicPr>
                   <pic:blipFill>
-                    <a:blip r:embed="rId167" cstate="print">
+                    <a:blip r:embed="rId170" cstate="print">
                       <a:extLst>
                         <a:ext uri="{28A0092B-C50C-407E-A947-70E740481C1C}">
                           <a14:useLocalDpi xmlns:a14="http://schemas.microsoft.com/office/drawing/2010/main" val="0"/>
@@ -14101,7 +14377,7 @@
                     </pic:cNvPicPr>
                   </pic:nvPicPr>
                   <pic:blipFill>
-                    <a:blip r:embed="rId168" cstate="print">
+                    <a:blip r:embed="rId171" cstate="print">
                       <a:extLst>
                         <a:ext uri="{28A0092B-C50C-407E-A947-70E740481C1C}">
                           <a14:useLocalDpi xmlns:a14="http://schemas.microsoft.com/office/drawing/2010/main" val="0"/>
@@ -14165,7 +14441,7 @@
                     </pic:cNvPicPr>
                   </pic:nvPicPr>
                   <pic:blipFill>
-                    <a:blip r:embed="rId165" cstate="print">
+                    <a:blip r:embed="rId168" cstate="print">
                       <a:extLst>
                         <a:ext uri="{28A0092B-C50C-407E-A947-70E740481C1C}">
                           <a14:useLocalDpi xmlns:a14="http://schemas.microsoft.com/office/drawing/2010/main" val="0"/>
@@ -14229,7 +14505,7 @@
                     </pic:cNvPicPr>
                   </pic:nvPicPr>
                   <pic:blipFill>
-                    <a:blip r:embed="rId169" cstate="print">
+                    <a:blip r:embed="rId172" cstate="print">
                       <a:extLst>
                         <a:ext uri="{28A0092B-C50C-407E-A947-70E740481C1C}">
                           <a14:useLocalDpi xmlns:a14="http://schemas.microsoft.com/office/drawing/2010/main" val="0"/>
@@ -14293,7 +14569,7 @@
                     </pic:cNvPicPr>
                   </pic:nvPicPr>
                   <pic:blipFill>
-                    <a:blip r:embed="rId170" cstate="print">
+                    <a:blip r:embed="rId173" cstate="print">
                       <a:extLst>
                         <a:ext uri="{28A0092B-C50C-407E-A947-70E740481C1C}">
                           <a14:useLocalDpi xmlns:a14="http://schemas.microsoft.com/office/drawing/2010/main" val="0"/>
@@ -14383,7 +14659,6 @@
           <w:szCs w:val="24"/>
           <w14:ligatures w14:val="none"/>
         </w:rPr>
-        <w:lastRenderedPageBreak/>
         <w:t>Câu 5</w:t>
       </w:r>
       <w:r>
@@ -14430,9 +14705,9 @@
             <o:lock v:ext="edit" aspectratio="t"/>
           </v:shapetype>
           <v:shape id="_x0000_i1025" type="#_x0000_t75" style="width:28.5pt;height:16.5pt" o:ole="">
-            <v:imagedata r:id="rId171" o:title=""/>
+            <v:imagedata r:id="rId174" o:title=""/>
           </v:shape>
-          <o:OLEObject Type="Embed" ProgID="Equation.DSMT4" ShapeID="_x0000_i1025" DrawAspect="Content" ObjectID="_1838738200" r:id="rId172"/>
+          <o:OLEObject Type="Embed" ProgID="Equation.DSMT4" ShapeID="_x0000_i1025" DrawAspect="Content" ObjectID="_1848056232" r:id="rId175"/>
         </w:object>
       </w:r>
       <w:r>
@@ -14457,9 +14732,9 @@
         </w:rPr>
         <w:object w:dxaOrig="1740" w:dyaOrig="630" w14:anchorId="4D16CE1D">
           <v:shape id="_x0000_i1026" type="#_x0000_t75" style="width:87pt;height:32.25pt" o:ole="">
-            <v:imagedata r:id="rId173" o:title=""/>
+            <v:imagedata r:id="rId176" o:title=""/>
           </v:shape>
-          <o:OLEObject Type="Embed" ProgID="Equation.DSMT4" ShapeID="_x0000_i1026" DrawAspect="Content" ObjectID="_1838738201" r:id="rId174"/>
+          <o:OLEObject Type="Embed" ProgID="Equation.DSMT4" ShapeID="_x0000_i1026" DrawAspect="Content" ObjectID="_1848056233" r:id="rId177"/>
         </w:object>
       </w:r>
       <w:r>
@@ -14477,9 +14752,9 @@
         </w:rPr>
         <w:object w:dxaOrig="2220" w:dyaOrig="620" w14:anchorId="7EEE035A">
           <v:shape id="_x0000_i1027" type="#_x0000_t75" style="width:111pt;height:31.5pt" o:ole="">
-            <v:imagedata r:id="rId175" o:title=""/>
+            <v:imagedata r:id="rId178" o:title=""/>
           </v:shape>
-          <o:OLEObject Type="Embed" ProgID="Equation.DSMT4" ShapeID="_x0000_i1027" DrawAspect="Content" ObjectID="_1838738202" r:id="rId176"/>
+          <o:OLEObject Type="Embed" ProgID="Equation.DSMT4" ShapeID="_x0000_i1027" DrawAspect="Content" ObjectID="_1848056234" r:id="rId179"/>
         </w:object>
       </w:r>
       <w:r>
@@ -14497,9 +14772,9 @@
         </w:rPr>
         <w:object w:dxaOrig="405" w:dyaOrig="405" w14:anchorId="0C038537">
           <v:shape id="_x0000_i1028" type="#_x0000_t75" style="width:21pt;height:21pt" o:ole="">
-            <v:imagedata r:id="rId177" o:title=""/>
+            <v:imagedata r:id="rId180" o:title=""/>
           </v:shape>
-          <o:OLEObject Type="Embed" ProgID="Equation.DSMT4" ShapeID="_x0000_i1028" DrawAspect="Content" ObjectID="_1838738203" r:id="rId178"/>
+          <o:OLEObject Type="Embed" ProgID="Equation.DSMT4" ShapeID="_x0000_i1028" DrawAspect="Content" ObjectID="_1848056235" r:id="rId181"/>
         </w:object>
       </w:r>
       <w:r>
@@ -14517,9 +14792,9 @@
         </w:rPr>
         <w:object w:dxaOrig="225" w:dyaOrig="300" w14:anchorId="7E1A49A5">
           <v:shape id="_x0000_i1029" type="#_x0000_t75" style="width:11.25pt;height:15pt" o:ole="">
-            <v:imagedata r:id="rId179" o:title=""/>
+            <v:imagedata r:id="rId182" o:title=""/>
           </v:shape>
-          <o:OLEObject Type="Embed" ProgID="Equation.DSMT4" ShapeID="_x0000_i1029" DrawAspect="Content" ObjectID="_1838738204" r:id="rId180"/>
+          <o:OLEObject Type="Embed" ProgID="Equation.DSMT4" ShapeID="_x0000_i1029" DrawAspect="Content" ObjectID="_1848056236" r:id="rId183"/>
         </w:object>
       </w:r>
       <w:r>
@@ -14537,9 +14812,9 @@
         </w:rPr>
         <w:object w:dxaOrig="220" w:dyaOrig="260" w14:anchorId="518847C2">
           <v:shape id="_x0000_i1030" type="#_x0000_t75" style="width:11.25pt;height:13.5pt" o:ole="">
-            <v:imagedata r:id="rId181" o:title=""/>
+            <v:imagedata r:id="rId184" o:title=""/>
           </v:shape>
-          <o:OLEObject Type="Embed" ProgID="Equation.DSMT4" ShapeID="_x0000_i1030" DrawAspect="Content" ObjectID="_1838738205" r:id="rId182"/>
+          <o:OLEObject Type="Embed" ProgID="Equation.DSMT4" ShapeID="_x0000_i1030" DrawAspect="Content" ObjectID="_1848056237" r:id="rId185"/>
         </w:object>
       </w:r>
       <w:r>
@@ -14557,9 +14832,9 @@
         </w:rPr>
         <w:object w:dxaOrig="1760" w:dyaOrig="320" w14:anchorId="7435D163">
           <v:shape id="_x0000_i1031" type="#_x0000_t75" style="width:87.75pt;height:15.75pt" o:ole="">
-            <v:imagedata r:id="rId183" o:title=""/>
+            <v:imagedata r:id="rId186" o:title=""/>
           </v:shape>
-          <o:OLEObject Type="Embed" ProgID="Equation.DSMT4" ShapeID="_x0000_i1031" DrawAspect="Content" ObjectID="_1838738206" r:id="rId184"/>
+          <o:OLEObject Type="Embed" ProgID="Equation.DSMT4" ShapeID="_x0000_i1031" DrawAspect="Content" ObjectID="_1848056238" r:id="rId187"/>
         </w:object>
       </w:r>
       <w:r>
@@ -14577,9 +14852,9 @@
         </w:rPr>
         <w:object w:dxaOrig="859" w:dyaOrig="279" w14:anchorId="4FAEC317">
           <v:shape id="_x0000_i1032" type="#_x0000_t75" style="width:42.75pt;height:14.25pt" o:ole="">
-            <v:imagedata r:id="rId185" o:title=""/>
+            <v:imagedata r:id="rId188" o:title=""/>
           </v:shape>
-          <o:OLEObject Type="Embed" ProgID="Equation.DSMT4" ShapeID="_x0000_i1032" DrawAspect="Content" ObjectID="_1838738207" r:id="rId186"/>
+          <o:OLEObject Type="Embed" ProgID="Equation.DSMT4" ShapeID="_x0000_i1032" DrawAspect="Content" ObjectID="_1848056239" r:id="rId189"/>
         </w:object>
       </w:r>
       <w:r>
@@ -14672,7 +14947,7 @@
                     </pic:cNvPicPr>
                   </pic:nvPicPr>
                   <pic:blipFill>
-                    <a:blip r:embed="rId187" cstate="print">
+                    <a:blip r:embed="rId190" cstate="print">
                       <a:extLst>
                         <a:ext uri="{28A0092B-C50C-407E-A947-70E740481C1C}">
                           <a14:useLocalDpi xmlns:a14="http://schemas.microsoft.com/office/drawing/2010/main" val="0"/>
@@ -14735,7 +15010,7 @@
                     </pic:cNvPicPr>
                   </pic:nvPicPr>
                   <pic:blipFill>
-                    <a:blip r:embed="rId188" cstate="print">
+                    <a:blip r:embed="rId191" cstate="print">
                       <a:extLst>
                         <a:ext uri="{28A0092B-C50C-407E-A947-70E740481C1C}">
                           <a14:useLocalDpi xmlns:a14="http://schemas.microsoft.com/office/drawing/2010/main" val="0"/>
@@ -14798,7 +15073,7 @@
                     </pic:cNvPicPr>
                   </pic:nvPicPr>
                   <pic:blipFill>
-                    <a:blip r:embed="rId189" cstate="print">
+                    <a:blip r:embed="rId192" cstate="print">
                       <a:extLst>
                         <a:ext uri="{28A0092B-C50C-407E-A947-70E740481C1C}">
                           <a14:useLocalDpi xmlns:a14="http://schemas.microsoft.com/office/drawing/2010/main" val="0"/>
@@ -14861,7 +15136,7 @@
                     </pic:cNvPicPr>
                   </pic:nvPicPr>
                   <pic:blipFill>
-                    <a:blip r:embed="rId190" cstate="print">
+                    <a:blip r:embed="rId193" cstate="print">
                       <a:extLst>
                         <a:ext uri="{28A0092B-C50C-407E-A947-70E740481C1C}">
                           <a14:useLocalDpi xmlns:a14="http://schemas.microsoft.com/office/drawing/2010/main" val="0"/>
@@ -14924,7 +15199,7 @@
                     </pic:cNvPicPr>
                   </pic:nvPicPr>
                   <pic:blipFill>
-                    <a:blip r:embed="rId191" cstate="print">
+                    <a:blip r:embed="rId194" cstate="print">
                       <a:extLst>
                         <a:ext uri="{28A0092B-C50C-407E-A947-70E740481C1C}">
                           <a14:useLocalDpi xmlns:a14="http://schemas.microsoft.com/office/drawing/2010/main" val="0"/>
@@ -14987,7 +15262,7 @@
                     </pic:cNvPicPr>
                   </pic:nvPicPr>
                   <pic:blipFill>
-                    <a:blip r:embed="rId192" cstate="print">
+                    <a:blip r:embed="rId195" cstate="print">
                       <a:extLst>
                         <a:ext uri="{28A0092B-C50C-407E-A947-70E740481C1C}">
                           <a14:useLocalDpi xmlns:a14="http://schemas.microsoft.com/office/drawing/2010/main" val="0"/>
@@ -15050,7 +15325,7 @@
                     </pic:cNvPicPr>
                   </pic:nvPicPr>
                   <pic:blipFill>
-                    <a:blip r:embed="rId193" cstate="print">
+                    <a:blip r:embed="rId196" cstate="print">
                       <a:extLst>
                         <a:ext uri="{28A0092B-C50C-407E-A947-70E740481C1C}">
                           <a14:useLocalDpi xmlns:a14="http://schemas.microsoft.com/office/drawing/2010/main" val="0"/>
@@ -15113,7 +15388,7 @@
                     </pic:cNvPicPr>
                   </pic:nvPicPr>
                   <pic:blipFill>
-                    <a:blip r:embed="rId194" cstate="print">
+                    <a:blip r:embed="rId197" cstate="print">
                       <a:extLst>
                         <a:ext uri="{28A0092B-C50C-407E-A947-70E740481C1C}">
                           <a14:useLocalDpi xmlns:a14="http://schemas.microsoft.com/office/drawing/2010/main" val="0"/>
@@ -15185,7 +15460,7 @@
                     </pic:cNvPicPr>
                   </pic:nvPicPr>
                   <pic:blipFill>
-                    <a:blip r:embed="rId195" cstate="print">
+                    <a:blip r:embed="rId198" cstate="print">
                       <a:extLst>
                         <a:ext uri="{28A0092B-C50C-407E-A947-70E740481C1C}">
                           <a14:useLocalDpi xmlns:a14="http://schemas.microsoft.com/office/drawing/2010/main" val="0"/>
@@ -15590,7 +15865,6 @@
         <w:outlineLvl w:val="0"/>
       </w:pPr>
       <w:r>
-        <w:lastRenderedPageBreak/>
         <w:tab/>
       </w:r>
       <w:r>
@@ -16849,6 +17123,7 @@
                 <w:b/>
                 <w:color w:val="000000" w:themeColor="text1"/>
               </w:rPr>
+              <w:lastRenderedPageBreak/>
               <w:t>b)</w:t>
             </w:r>
             <w:r>

</xml_diff>